<commit_message>
Se añadio el menu de descuentos en pseudocodigo y codigo
</commit_message>
<xml_diff>
--- a/docs/Analisis y Pseudocodigo.docx
+++ b/docs/Analisis y Pseudocodigo.docx
@@ -469,19 +469,11 @@
         </w:rPr>
         <w:t xml:space="preserve">Se muestra el resumen del </w:t>
       </w:r>
-      <w:proofErr w:type="gramStart"/>
-      <w:r>
-        <w:rPr>
-          <w:rFonts w:ascii="Times New Roman" w:hAnsi="Times New Roman" w:cs="Times New Roman"/>
-        </w:rPr>
-        <w:t>día</w:t>
-      </w:r>
-      <w:proofErr w:type="gramEnd"/>
-      <w:r>
-        <w:rPr>
-          <w:rFonts w:ascii="Times New Roman" w:hAnsi="Times New Roman" w:cs="Times New Roman"/>
-        </w:rPr>
-        <w:t xml:space="preserve"> así como también un mensaje de error si se solicita sin haber ventas </w:t>
+      <w:r>
+        <w:rPr>
+          <w:rFonts w:ascii="Times New Roman" w:hAnsi="Times New Roman" w:cs="Times New Roman"/>
+        </w:rPr>
+        <w:t xml:space="preserve">día así como también un mensaje de error si se solicita sin haber ventas </w:t>
       </w:r>
     </w:p>
     <w:p>
@@ -652,29 +644,91 @@
         <w:rPr>
           <w:rFonts w:ascii="Times New Roman" w:hAnsi="Times New Roman" w:cs="Times New Roman"/>
         </w:rPr>
+        <w:t xml:space="preserve">Definir Resumen_precio como Real            </w:t>
+      </w:r>
+    </w:p>
+    <w:p>
+      <w:pPr>
+        <w:rPr>
+          <w:rFonts w:ascii="Times New Roman" w:hAnsi="Times New Roman" w:cs="Times New Roman"/>
+        </w:rPr>
+      </w:pPr>
+      <w:r>
+        <w:rPr>
+          <w:rFonts w:ascii="Times New Roman" w:hAnsi="Times New Roman" w:cs="Times New Roman"/>
+        </w:rPr>
+        <w:t xml:space="preserve">Definir Descuento como </w:t>
+      </w:r>
+      <w:r>
+        <w:rPr>
+          <w:rFonts w:ascii="Times New Roman" w:hAnsi="Times New Roman" w:cs="Times New Roman"/>
+        </w:rPr>
+        <w:t>Real</w:t>
+      </w:r>
+      <w:r>
+        <w:rPr>
+          <w:rFonts w:ascii="Times New Roman" w:hAnsi="Times New Roman" w:cs="Times New Roman"/>
+        </w:rPr>
+        <w:t xml:space="preserve">     </w:t>
+      </w:r>
+    </w:p>
+    <w:p>
+      <w:pPr>
+        <w:rPr>
+          <w:rFonts w:ascii="Times New Roman" w:hAnsi="Times New Roman" w:cs="Times New Roman"/>
+        </w:rPr>
+      </w:pPr>
+      <w:r>
+        <w:rPr>
+          <w:rFonts w:ascii="Times New Roman" w:hAnsi="Times New Roman" w:cs="Times New Roman"/>
+        </w:rPr>
+        <w:t>Definir IVA como real</w:t>
+      </w:r>
+    </w:p>
+    <w:p>
+      <w:pPr>
+        <w:rPr>
+          <w:rFonts w:ascii="Times New Roman" w:hAnsi="Times New Roman" w:cs="Times New Roman"/>
+        </w:rPr>
+      </w:pPr>
+      <w:r>
+        <w:rPr>
+          <w:rFonts w:ascii="Times New Roman" w:hAnsi="Times New Roman" w:cs="Times New Roman"/>
+        </w:rPr>
+        <w:t>Definir total como Real</w:t>
+      </w:r>
+    </w:p>
+    <w:p>
+      <w:pPr>
+        <w:rPr>
+          <w:rFonts w:ascii="Times New Roman" w:hAnsi="Times New Roman" w:cs="Times New Roman"/>
+        </w:rPr>
+      </w:pPr>
+      <w:r>
+        <w:rPr>
+          <w:rFonts w:ascii="Times New Roman" w:hAnsi="Times New Roman" w:cs="Times New Roman"/>
+        </w:rPr>
+        <w:t>Definir Pago como Real</w:t>
+      </w:r>
+    </w:p>
+    <w:p>
+      <w:pPr>
+        <w:rPr>
+          <w:rFonts w:ascii="Times New Roman" w:hAnsi="Times New Roman" w:cs="Times New Roman"/>
+        </w:rPr>
+      </w:pPr>
+      <w:r>
+        <w:rPr>
+          <w:rFonts w:ascii="Times New Roman" w:hAnsi="Times New Roman" w:cs="Times New Roman"/>
+        </w:rPr>
         <w:t xml:space="preserve">Definir </w:t>
       </w:r>
-      <w:proofErr w:type="spellStart"/>
-      <w:r>
-        <w:rPr>
-          <w:rFonts w:ascii="Times New Roman" w:hAnsi="Times New Roman" w:cs="Times New Roman"/>
-        </w:rPr>
-        <w:t>Resumen_precio</w:t>
-      </w:r>
-      <w:proofErr w:type="spellEnd"/>
-      <w:r>
-        <w:rPr>
-          <w:rFonts w:ascii="Times New Roman" w:hAnsi="Times New Roman" w:cs="Times New Roman"/>
-        </w:rPr>
-        <w:t xml:space="preserve"> como Real                 </w:t>
-      </w:r>
-    </w:p>
-    <w:p>
-      <w:pPr>
-        <w:rPr>
-          <w:rFonts w:ascii="Times New Roman" w:hAnsi="Times New Roman" w:cs="Times New Roman"/>
-        </w:rPr>
-      </w:pPr>
+      <w:r>
+        <w:rPr>
+          <w:rFonts w:ascii="Times New Roman" w:hAnsi="Times New Roman" w:cs="Times New Roman"/>
+        </w:rPr>
+        <w:t>Cambio como Real</w:t>
+      </w:r>
     </w:p>
     <w:p>
       <w:pPr>
@@ -725,468 +779,1041 @@
         <w:rPr>
           <w:rFonts w:ascii="Times New Roman" w:hAnsi="Times New Roman" w:cs="Times New Roman"/>
         </w:rPr>
+        <w:t xml:space="preserve">  Mostrar "Buen dia, Que desea hacer?"           </w:t>
+      </w:r>
+    </w:p>
+    <w:p>
+      <w:pPr>
+        <w:rPr>
+          <w:rFonts w:ascii="Times New Roman" w:hAnsi="Times New Roman" w:cs="Times New Roman"/>
+        </w:rPr>
+      </w:pPr>
+      <w:r>
+        <w:rPr>
+          <w:rFonts w:ascii="Times New Roman" w:hAnsi="Times New Roman" w:cs="Times New Roman"/>
+        </w:rPr>
+        <w:t xml:space="preserve">  Mostrar "1. Registrar venta"</w:t>
+      </w:r>
+    </w:p>
+    <w:p>
+      <w:pPr>
+        <w:rPr>
+          <w:rFonts w:ascii="Times New Roman" w:hAnsi="Times New Roman" w:cs="Times New Roman"/>
+        </w:rPr>
+      </w:pPr>
+      <w:r>
+        <w:rPr>
+          <w:rFonts w:ascii="Times New Roman" w:hAnsi="Times New Roman" w:cs="Times New Roman"/>
+        </w:rPr>
+        <w:t xml:space="preserve">  Mostrar "2. Ver el resumen parcial del dia"</w:t>
+      </w:r>
+    </w:p>
+    <w:p>
+      <w:pPr>
+        <w:rPr>
+          <w:rFonts w:ascii="Times New Roman" w:hAnsi="Times New Roman" w:cs="Times New Roman"/>
+        </w:rPr>
+      </w:pPr>
+      <w:r>
+        <w:rPr>
+          <w:rFonts w:ascii="Times New Roman" w:hAnsi="Times New Roman" w:cs="Times New Roman"/>
+        </w:rPr>
+        <w:t xml:space="preserve">  Mostrar "3. Cerrar caja y salir"</w:t>
+      </w:r>
+    </w:p>
+    <w:p>
+      <w:pPr>
+        <w:rPr>
+          <w:rFonts w:ascii="Times New Roman" w:hAnsi="Times New Roman" w:cs="Times New Roman"/>
+        </w:rPr>
+      </w:pPr>
+      <w:r>
+        <w:rPr>
+          <w:rFonts w:ascii="Times New Roman" w:hAnsi="Times New Roman" w:cs="Times New Roman"/>
+        </w:rPr>
+        <w:t>Escribir en Menú</w:t>
+      </w:r>
+    </w:p>
+    <w:p>
+      <w:pPr>
+        <w:rPr>
+          <w:rFonts w:ascii="Times New Roman" w:hAnsi="Times New Roman" w:cs="Times New Roman"/>
+        </w:rPr>
+      </w:pPr>
+      <w:r>
+        <w:rPr>
+          <w:rFonts w:ascii="Times New Roman" w:hAnsi="Times New Roman" w:cs="Times New Roman"/>
+        </w:rPr>
+        <w:t>Cambiar entre Menú</w:t>
+      </w:r>
+    </w:p>
+    <w:p>
+      <w:pPr>
+        <w:rPr>
+          <w:rFonts w:ascii="Times New Roman" w:hAnsi="Times New Roman" w:cs="Times New Roman"/>
+        </w:rPr>
+      </w:pPr>
+      <w:r>
+        <w:rPr>
+          <w:rFonts w:ascii="Times New Roman" w:hAnsi="Times New Roman" w:cs="Times New Roman"/>
+        </w:rPr>
+        <w:t xml:space="preserve"> </w:t>
+      </w:r>
+    </w:p>
+    <w:p>
+      <w:pPr>
+        <w:rPr>
+          <w:rFonts w:ascii="Times New Roman" w:hAnsi="Times New Roman" w:cs="Times New Roman"/>
+        </w:rPr>
+      </w:pPr>
+      <w:r>
+        <w:rPr>
+          <w:rFonts w:ascii="Times New Roman" w:hAnsi="Times New Roman" w:cs="Times New Roman"/>
+        </w:rPr>
+        <w:t>Si es 1:</w:t>
+      </w:r>
+    </w:p>
+    <w:p>
+      <w:pPr>
+        <w:rPr>
+          <w:rFonts w:ascii="Times New Roman" w:hAnsi="Times New Roman" w:cs="Times New Roman"/>
+        </w:rPr>
+      </w:pPr>
+      <w:r>
+        <w:rPr>
+          <w:rFonts w:ascii="Times New Roman" w:hAnsi="Times New Roman" w:cs="Times New Roman"/>
+        </w:rPr>
+        <w:t xml:space="preserve"> Subtotal = 0</w:t>
+      </w:r>
+    </w:p>
+    <w:p>
+      <w:pPr>
+        <w:rPr>
+          <w:rFonts w:ascii="Times New Roman" w:hAnsi="Times New Roman" w:cs="Times New Roman"/>
+        </w:rPr>
+      </w:pPr>
+      <w:r>
+        <w:rPr>
+          <w:rFonts w:ascii="Times New Roman" w:hAnsi="Times New Roman" w:cs="Times New Roman"/>
+        </w:rPr>
+        <w:t xml:space="preserve">   Repetir</w:t>
+      </w:r>
+    </w:p>
+    <w:p>
+      <w:pPr>
+        <w:rPr>
+          <w:rFonts w:ascii="Times New Roman" w:hAnsi="Times New Roman" w:cs="Times New Roman"/>
+        </w:rPr>
+      </w:pPr>
+      <w:r>
+        <w:rPr>
+          <w:rFonts w:ascii="Times New Roman" w:hAnsi="Times New Roman" w:cs="Times New Roman"/>
+        </w:rPr>
+        <w:lastRenderedPageBreak/>
+        <w:t xml:space="preserve">   Mostrar "Ingrese el precio del producto o 0 para terminar"</w:t>
+      </w:r>
+    </w:p>
+    <w:p>
+      <w:pPr>
+        <w:rPr>
+          <w:rFonts w:ascii="Times New Roman" w:hAnsi="Times New Roman" w:cs="Times New Roman"/>
+        </w:rPr>
+      </w:pPr>
+      <w:r>
+        <w:rPr>
+          <w:rFonts w:ascii="Times New Roman" w:hAnsi="Times New Roman" w:cs="Times New Roman"/>
+        </w:rPr>
+        <w:t xml:space="preserve">   Escribir en precio</w:t>
+      </w:r>
+    </w:p>
+    <w:p>
+      <w:pPr>
+        <w:rPr>
+          <w:rFonts w:ascii="Times New Roman" w:hAnsi="Times New Roman" w:cs="Times New Roman"/>
+        </w:rPr>
+      </w:pPr>
+      <w:r>
+        <w:rPr>
+          <w:rFonts w:ascii="Times New Roman" w:hAnsi="Times New Roman" w:cs="Times New Roman"/>
+        </w:rPr>
+        <w:t xml:space="preserve">   Si precio &lt; 0 Entonces</w:t>
+      </w:r>
+    </w:p>
+    <w:p>
+      <w:pPr>
+        <w:rPr>
+          <w:rFonts w:ascii="Times New Roman" w:hAnsi="Times New Roman" w:cs="Times New Roman"/>
+        </w:rPr>
+      </w:pPr>
+      <w:r>
+        <w:rPr>
+          <w:rFonts w:ascii="Times New Roman" w:hAnsi="Times New Roman" w:cs="Times New Roman"/>
+        </w:rPr>
+        <w:t xml:space="preserve">   Mostrar "Error, ingrese un precio valido"</w:t>
+      </w:r>
+    </w:p>
+    <w:p>
+      <w:pPr>
+        <w:rPr>
+          <w:rFonts w:ascii="Times New Roman" w:hAnsi="Times New Roman" w:cs="Times New Roman"/>
+        </w:rPr>
+      </w:pPr>
+      <w:r>
+        <w:rPr>
+          <w:rFonts w:ascii="Times New Roman" w:hAnsi="Times New Roman" w:cs="Times New Roman"/>
+        </w:rPr>
+        <w:t xml:space="preserve">     Sino</w:t>
+      </w:r>
+    </w:p>
+    <w:p>
+      <w:pPr>
+        <w:rPr>
+          <w:rFonts w:ascii="Times New Roman" w:hAnsi="Times New Roman" w:cs="Times New Roman"/>
+        </w:rPr>
+      </w:pPr>
+      <w:r>
+        <w:rPr>
+          <w:rFonts w:ascii="Times New Roman" w:hAnsi="Times New Roman" w:cs="Times New Roman"/>
+        </w:rPr>
+        <w:t xml:space="preserve">     Si precio &gt; 0 Entonce</w:t>
+      </w:r>
+      <w:r>
+        <w:rPr>
+          <w:rFonts w:ascii="Times New Roman" w:hAnsi="Times New Roman" w:cs="Times New Roman"/>
+        </w:rPr>
+        <w:t>s</w:t>
+      </w:r>
+    </w:p>
+    <w:p>
+      <w:pPr>
+        <w:rPr>
+          <w:rFonts w:ascii="Times New Roman" w:hAnsi="Times New Roman" w:cs="Times New Roman"/>
+        </w:rPr>
+      </w:pPr>
+      <w:r>
+        <w:rPr>
+          <w:rFonts w:ascii="Times New Roman" w:hAnsi="Times New Roman" w:cs="Times New Roman"/>
+        </w:rPr>
+        <w:t xml:space="preserve">     Resumen_precio = Resumen_precio + precio    </w:t>
+      </w:r>
+    </w:p>
+    <w:p>
+      <w:pPr>
+        <w:rPr>
+          <w:rFonts w:ascii="Times New Roman" w:hAnsi="Times New Roman" w:cs="Times New Roman"/>
+        </w:rPr>
+      </w:pPr>
+      <w:r>
+        <w:rPr>
+          <w:rFonts w:ascii="Times New Roman" w:hAnsi="Times New Roman" w:cs="Times New Roman"/>
+        </w:rPr>
+        <w:t xml:space="preserve">     Mostrar "Ingrese la cantidad de producto"</w:t>
+      </w:r>
+    </w:p>
+    <w:p>
+      <w:pPr>
+        <w:rPr>
+          <w:rFonts w:ascii="Times New Roman" w:hAnsi="Times New Roman" w:cs="Times New Roman"/>
+        </w:rPr>
+      </w:pPr>
+      <w:r>
+        <w:rPr>
+          <w:rFonts w:ascii="Times New Roman" w:hAnsi="Times New Roman" w:cs="Times New Roman"/>
+        </w:rPr>
+        <w:t xml:space="preserve">     Escribir en Cantidad</w:t>
+      </w:r>
+    </w:p>
+    <w:p>
+      <w:pPr>
+        <w:rPr>
+          <w:rFonts w:ascii="Times New Roman" w:hAnsi="Times New Roman" w:cs="Times New Roman"/>
+        </w:rPr>
+      </w:pPr>
+      <w:r>
+        <w:rPr>
+          <w:rFonts w:ascii="Times New Roman" w:hAnsi="Times New Roman" w:cs="Times New Roman"/>
+        </w:rPr>
+        <w:t xml:space="preserve">     Mientras Cantidad &lt; 1 o Cantidad &gt; 100</w:t>
+      </w:r>
+    </w:p>
+    <w:p>
+      <w:pPr>
+        <w:rPr>
+          <w:rFonts w:ascii="Times New Roman" w:hAnsi="Times New Roman" w:cs="Times New Roman"/>
+        </w:rPr>
+      </w:pPr>
+      <w:r>
+        <w:rPr>
+          <w:rFonts w:ascii="Times New Roman" w:hAnsi="Times New Roman" w:cs="Times New Roman"/>
+        </w:rPr>
+        <w:t xml:space="preserve">     Mostrar "Error, la cantidad debe ser de 1 a 100"</w:t>
+      </w:r>
+    </w:p>
+    <w:p>
+      <w:pPr>
+        <w:rPr>
+          <w:rFonts w:ascii="Times New Roman" w:hAnsi="Times New Roman" w:cs="Times New Roman"/>
+        </w:rPr>
+      </w:pPr>
+      <w:r>
+        <w:rPr>
+          <w:rFonts w:ascii="Times New Roman" w:hAnsi="Times New Roman" w:cs="Times New Roman"/>
+        </w:rPr>
+        <w:t xml:space="preserve">     Mostrar "Ingrese la cantidad de producto"</w:t>
+      </w:r>
+    </w:p>
+    <w:p>
+      <w:pPr>
+        <w:rPr>
+          <w:rFonts w:ascii="Times New Roman" w:hAnsi="Times New Roman" w:cs="Times New Roman"/>
+        </w:rPr>
+      </w:pPr>
+      <w:r>
+        <w:rPr>
+          <w:rFonts w:ascii="Times New Roman" w:hAnsi="Times New Roman" w:cs="Times New Roman"/>
+        </w:rPr>
+        <w:t xml:space="preserve">     Escribir en Cantidad</w:t>
+      </w:r>
+    </w:p>
+    <w:p>
+      <w:pPr>
+        <w:rPr>
+          <w:rFonts w:ascii="Times New Roman" w:hAnsi="Times New Roman" w:cs="Times New Roman"/>
+        </w:rPr>
+      </w:pPr>
+      <w:r>
+        <w:rPr>
+          <w:rFonts w:ascii="Times New Roman" w:hAnsi="Times New Roman" w:cs="Times New Roman"/>
+        </w:rPr>
         <w:t xml:space="preserve">  </w:t>
       </w:r>
-      <w:proofErr w:type="gramStart"/>
-      <w:r>
-        <w:rPr>
-          <w:rFonts w:ascii="Times New Roman" w:hAnsi="Times New Roman" w:cs="Times New Roman"/>
-        </w:rPr>
-        <w:t xml:space="preserve">Mostrar "Buen </w:t>
-      </w:r>
-      <w:proofErr w:type="spellStart"/>
-      <w:r>
-        <w:rPr>
-          <w:rFonts w:ascii="Times New Roman" w:hAnsi="Times New Roman" w:cs="Times New Roman"/>
-        </w:rPr>
-        <w:t>dia</w:t>
-      </w:r>
-      <w:proofErr w:type="spellEnd"/>
-      <w:r>
-        <w:rPr>
-          <w:rFonts w:ascii="Times New Roman" w:hAnsi="Times New Roman" w:cs="Times New Roman"/>
-        </w:rPr>
-        <w:t>, Que desea hacer?</w:t>
-      </w:r>
-      <w:proofErr w:type="gramEnd"/>
-      <w:r>
-        <w:rPr>
-          <w:rFonts w:ascii="Times New Roman" w:hAnsi="Times New Roman" w:cs="Times New Roman"/>
-        </w:rPr>
-        <w:t xml:space="preserve">"           </w:t>
-      </w:r>
-    </w:p>
-    <w:p>
-      <w:pPr>
-        <w:rPr>
-          <w:rFonts w:ascii="Times New Roman" w:hAnsi="Times New Roman" w:cs="Times New Roman"/>
-        </w:rPr>
-      </w:pPr>
-      <w:r>
-        <w:rPr>
-          <w:rFonts w:ascii="Times New Roman" w:hAnsi="Times New Roman" w:cs="Times New Roman"/>
-        </w:rPr>
-        <w:t xml:space="preserve">  Mostrar "1. Registrar venta"</w:t>
-      </w:r>
-    </w:p>
-    <w:p>
-      <w:pPr>
-        <w:rPr>
-          <w:rFonts w:ascii="Times New Roman" w:hAnsi="Times New Roman" w:cs="Times New Roman"/>
-        </w:rPr>
-      </w:pPr>
-      <w:r>
-        <w:rPr>
-          <w:rFonts w:ascii="Times New Roman" w:hAnsi="Times New Roman" w:cs="Times New Roman"/>
-        </w:rPr>
-        <w:t xml:space="preserve">  Mostrar "2. Ver el resumen parcial del </w:t>
-      </w:r>
-      <w:proofErr w:type="spellStart"/>
-      <w:r>
-        <w:rPr>
-          <w:rFonts w:ascii="Times New Roman" w:hAnsi="Times New Roman" w:cs="Times New Roman"/>
-        </w:rPr>
-        <w:t>dia</w:t>
-      </w:r>
-      <w:proofErr w:type="spellEnd"/>
+    </w:p>
+    <w:p>
+      <w:pPr>
+        <w:rPr>
+          <w:rFonts w:ascii="Times New Roman" w:hAnsi="Times New Roman" w:cs="Times New Roman"/>
+        </w:rPr>
+      </w:pPr>
+      <w:r>
+        <w:rPr>
+          <w:rFonts w:ascii="Times New Roman" w:hAnsi="Times New Roman" w:cs="Times New Roman"/>
+        </w:rPr>
+        <w:t>FinMientras</w:t>
+      </w:r>
+    </w:p>
+    <w:p>
+      <w:pPr>
+        <w:rPr>
+          <w:rFonts w:ascii="Times New Roman" w:hAnsi="Times New Roman" w:cs="Times New Roman"/>
+        </w:rPr>
+      </w:pPr>
+      <w:r>
+        <w:rPr>
+          <w:rFonts w:ascii="Times New Roman" w:hAnsi="Times New Roman" w:cs="Times New Roman"/>
+        </w:rPr>
+        <w:t xml:space="preserve">Subtotal = Subtotal + precio * Cantidad </w:t>
+      </w:r>
+    </w:p>
+    <w:p>
+      <w:pPr>
+        <w:rPr>
+          <w:rFonts w:ascii="Times New Roman" w:hAnsi="Times New Roman" w:cs="Times New Roman"/>
+        </w:rPr>
+      </w:pPr>
+      <w:r>
+        <w:rPr>
+          <w:rFonts w:ascii="Times New Roman" w:hAnsi="Times New Roman" w:cs="Times New Roman"/>
+        </w:rPr>
+        <w:t xml:space="preserve">FinSi </w:t>
+      </w:r>
+    </w:p>
+    <w:p>
+      <w:pPr>
+        <w:rPr>
+          <w:rFonts w:ascii="Times New Roman" w:hAnsi="Times New Roman" w:cs="Times New Roman"/>
+        </w:rPr>
+      </w:pPr>
+      <w:r>
+        <w:rPr>
+          <w:rFonts w:ascii="Times New Roman" w:hAnsi="Times New Roman" w:cs="Times New Roman"/>
+        </w:rPr>
+        <w:t xml:space="preserve">FinSi </w:t>
+      </w:r>
+    </w:p>
+    <w:p>
+      <w:pPr>
+        <w:rPr>
+          <w:rFonts w:ascii="Times New Roman" w:hAnsi="Times New Roman" w:cs="Times New Roman"/>
+        </w:rPr>
+      </w:pPr>
+      <w:r>
+        <w:rPr>
+          <w:rFonts w:ascii="Times New Roman" w:hAnsi="Times New Roman" w:cs="Times New Roman"/>
+        </w:rPr>
+        <w:t xml:space="preserve">Hasta que precio = 0 </w:t>
+      </w:r>
+    </w:p>
+    <w:p>
+      <w:pPr>
+        <w:rPr>
+          <w:rFonts w:ascii="Times New Roman" w:hAnsi="Times New Roman" w:cs="Times New Roman"/>
+        </w:rPr>
+      </w:pPr>
+      <w:r>
+        <w:rPr>
+          <w:rFonts w:ascii="Times New Roman" w:hAnsi="Times New Roman" w:cs="Times New Roman"/>
+        </w:rPr>
+        <w:t>Si subtotal</w:t>
+      </w:r>
+      <w:r>
+        <w:rPr>
+          <w:rFonts w:ascii="Times New Roman" w:hAnsi="Times New Roman" w:cs="Times New Roman"/>
+        </w:rPr>
+        <w:t xml:space="preserve"> </w:t>
+      </w:r>
+      <w:r>
+        <w:rPr>
+          <w:rFonts w:ascii="Times New Roman" w:hAnsi="Times New Roman" w:cs="Times New Roman"/>
+        </w:rPr>
+        <w:t>&gt;</w:t>
+      </w:r>
+      <w:r>
+        <w:rPr>
+          <w:rFonts w:ascii="Times New Roman" w:hAnsi="Times New Roman" w:cs="Times New Roman"/>
+        </w:rPr>
+        <w:t xml:space="preserve"> 0 Entonces</w:t>
+      </w:r>
+    </w:p>
+    <w:p>
+      <w:pPr>
+        <w:rPr>
+          <w:rFonts w:ascii="Times New Roman" w:hAnsi="Times New Roman" w:cs="Times New Roman"/>
+        </w:rPr>
+      </w:pPr>
+      <w:r>
+        <w:rPr>
+          <w:rFonts w:ascii="Times New Roman" w:hAnsi="Times New Roman" w:cs="Times New Roman"/>
+        </w:rPr>
+        <w:t xml:space="preserve">Descuento = 0 </w:t>
+      </w:r>
+    </w:p>
+    <w:p>
+      <w:pPr>
+        <w:rPr>
+          <w:rFonts w:ascii="Times New Roman" w:hAnsi="Times New Roman" w:cs="Times New Roman"/>
+        </w:rPr>
+      </w:pPr>
+      <w:r>
+        <w:rPr>
+          <w:rFonts w:ascii="Times New Roman" w:hAnsi="Times New Roman" w:cs="Times New Roman"/>
+        </w:rPr>
+        <w:t xml:space="preserve">Si Subtotal &gt;= 100 Y Subtotal &lt; 500 Entonces </w:t>
+      </w:r>
+    </w:p>
+    <w:p>
+      <w:pPr>
+        <w:rPr>
+          <w:rFonts w:ascii="Times New Roman" w:hAnsi="Times New Roman" w:cs="Times New Roman"/>
+        </w:rPr>
+      </w:pPr>
+      <w:r>
+        <w:rPr>
+          <w:rFonts w:ascii="Times New Roman" w:hAnsi="Times New Roman" w:cs="Times New Roman"/>
+        </w:rPr>
+        <w:t xml:space="preserve">Descuento = Subtotal * 5% </w:t>
+      </w:r>
+    </w:p>
+    <w:p>
+      <w:pPr>
+        <w:rPr>
+          <w:rFonts w:ascii="Times New Roman" w:hAnsi="Times New Roman" w:cs="Times New Roman"/>
+        </w:rPr>
+      </w:pPr>
+      <w:r>
+        <w:rPr>
+          <w:rFonts w:ascii="Times New Roman" w:hAnsi="Times New Roman" w:cs="Times New Roman"/>
+        </w:rPr>
+        <w:t xml:space="preserve">Sino </w:t>
+      </w:r>
+    </w:p>
+    <w:p>
+      <w:pPr>
+        <w:rPr>
+          <w:rFonts w:ascii="Times New Roman" w:hAnsi="Times New Roman" w:cs="Times New Roman"/>
+        </w:rPr>
+      </w:pPr>
+      <w:r>
+        <w:rPr>
+          <w:rFonts w:ascii="Times New Roman" w:hAnsi="Times New Roman" w:cs="Times New Roman"/>
+        </w:rPr>
+        <w:t xml:space="preserve">Si Subtotal &gt;= 500 Entonces </w:t>
+      </w:r>
+    </w:p>
+    <w:p>
+      <w:pPr>
+        <w:rPr>
+          <w:rFonts w:ascii="Times New Roman" w:hAnsi="Times New Roman" w:cs="Times New Roman"/>
+        </w:rPr>
+      </w:pPr>
+      <w:r>
+        <w:rPr>
+          <w:rFonts w:ascii="Times New Roman" w:hAnsi="Times New Roman" w:cs="Times New Roman"/>
+        </w:rPr>
+        <w:t>Descuento = Subtotal * 10%</w:t>
+      </w:r>
+    </w:p>
+    <w:p>
+      <w:pPr>
+        <w:rPr>
+          <w:rFonts w:ascii="Times New Roman" w:hAnsi="Times New Roman" w:cs="Times New Roman"/>
+        </w:rPr>
+      </w:pPr>
+      <w:r>
+        <w:rPr>
+          <w:rFonts w:ascii="Times New Roman" w:hAnsi="Times New Roman" w:cs="Times New Roman"/>
+        </w:rPr>
+        <w:t xml:space="preserve"> FinSi </w:t>
+      </w:r>
+    </w:p>
+    <w:p>
+      <w:pPr>
+        <w:rPr>
+          <w:rFonts w:ascii="Times New Roman" w:hAnsi="Times New Roman" w:cs="Times New Roman"/>
+        </w:rPr>
+      </w:pPr>
+      <w:r>
+        <w:rPr>
+          <w:rFonts w:ascii="Times New Roman" w:hAnsi="Times New Roman" w:cs="Times New Roman"/>
+        </w:rPr>
+        <w:lastRenderedPageBreak/>
+        <w:t xml:space="preserve">FinSi </w:t>
+      </w:r>
+    </w:p>
+    <w:p>
+      <w:pPr>
+        <w:rPr>
+          <w:rFonts w:ascii="Times New Roman" w:hAnsi="Times New Roman" w:cs="Times New Roman"/>
+        </w:rPr>
+      </w:pPr>
+      <w:r>
+        <w:rPr>
+          <w:rFonts w:ascii="Times New Roman" w:hAnsi="Times New Roman" w:cs="Times New Roman"/>
+        </w:rPr>
+        <w:t xml:space="preserve">Subtotal = Subtotal - Descuento </w:t>
+      </w:r>
+    </w:p>
+    <w:p>
+      <w:pPr>
+        <w:rPr>
+          <w:rFonts w:ascii="Times New Roman" w:hAnsi="Times New Roman" w:cs="Times New Roman"/>
+        </w:rPr>
+      </w:pPr>
+      <w:r>
+        <w:rPr>
+          <w:rFonts w:ascii="Times New Roman" w:hAnsi="Times New Roman" w:cs="Times New Roman"/>
+        </w:rPr>
+        <w:t xml:space="preserve">IVA = </w:t>
+      </w:r>
+      <w:r>
+        <w:rPr>
+          <w:rFonts w:ascii="Times New Roman" w:hAnsi="Times New Roman" w:cs="Times New Roman"/>
+        </w:rPr>
+        <w:t>Subtotal * 12%</w:t>
+      </w:r>
+      <w:r>
+        <w:rPr>
+          <w:rFonts w:ascii="Times New Roman" w:hAnsi="Times New Roman" w:cs="Times New Roman"/>
+        </w:rPr>
+        <w:t xml:space="preserve"> </w:t>
+      </w:r>
+    </w:p>
+    <w:p>
+      <w:pPr>
+        <w:spacing w:line="480" w:lineRule="auto"/>
+        <w:rPr>
+          <w:rFonts w:ascii="Times New Roman" w:hAnsi="Times New Roman" w:cs="Times New Roman"/>
+        </w:rPr>
+      </w:pPr>
+      <w:r>
+        <w:rPr>
+          <w:rFonts w:ascii="Times New Roman" w:hAnsi="Times New Roman" w:cs="Times New Roman"/>
+        </w:rPr>
+        <w:t>Total = IVA + Subtotal</w:t>
+      </w:r>
+    </w:p>
+    <w:p>
+      <w:pPr>
+        <w:rPr>
+          <w:rFonts w:ascii="Times New Roman" w:hAnsi="Times New Roman" w:cs="Times New Roman"/>
+        </w:rPr>
+      </w:pPr>
+      <w:r>
+        <w:rPr>
+          <w:rFonts w:ascii="Times New Roman" w:hAnsi="Times New Roman" w:cs="Times New Roman"/>
+        </w:rPr>
+        <w:t xml:space="preserve">Mostrar </w:t>
+      </w:r>
       <w:r>
         <w:rPr>
           <w:rFonts w:ascii="Times New Roman" w:hAnsi="Times New Roman" w:cs="Times New Roman"/>
         </w:rPr>
         <w:t>"</w:t>
       </w:r>
-    </w:p>
-    <w:p>
-      <w:pPr>
-        <w:rPr>
-          <w:rFonts w:ascii="Times New Roman" w:hAnsi="Times New Roman" w:cs="Times New Roman"/>
-        </w:rPr>
-      </w:pPr>
-      <w:r>
-        <w:rPr>
-          <w:rFonts w:ascii="Times New Roman" w:hAnsi="Times New Roman" w:cs="Times New Roman"/>
-        </w:rPr>
-        <w:t xml:space="preserve">  Mostrar "3. Cerrar caja y salir"</w:t>
-      </w:r>
-    </w:p>
-    <w:p>
-      <w:pPr>
-        <w:rPr>
-          <w:rFonts w:ascii="Times New Roman" w:hAnsi="Times New Roman" w:cs="Times New Roman"/>
-        </w:rPr>
-      </w:pPr>
-      <w:r>
-        <w:rPr>
-          <w:rFonts w:ascii="Times New Roman" w:hAnsi="Times New Roman" w:cs="Times New Roman"/>
-        </w:rPr>
-        <w:t>Escribir en Menú</w:t>
-      </w:r>
-    </w:p>
-    <w:p>
-      <w:pPr>
-        <w:rPr>
-          <w:rFonts w:ascii="Times New Roman" w:hAnsi="Times New Roman" w:cs="Times New Roman"/>
-        </w:rPr>
-      </w:pPr>
-      <w:r>
-        <w:rPr>
-          <w:rFonts w:ascii="Times New Roman" w:hAnsi="Times New Roman" w:cs="Times New Roman"/>
-        </w:rPr>
-        <w:t>Cambiar entre Menú</w:t>
-      </w:r>
-    </w:p>
-    <w:p>
-      <w:pPr>
-        <w:rPr>
-          <w:rFonts w:ascii="Times New Roman" w:hAnsi="Times New Roman" w:cs="Times New Roman"/>
-        </w:rPr>
-      </w:pPr>
+      <w:r>
+        <w:rPr>
+          <w:rFonts w:ascii="Times New Roman" w:hAnsi="Times New Roman" w:cs="Times New Roman"/>
+        </w:rPr>
+        <w:t xml:space="preserve">El total de la compra es: </w:t>
+      </w:r>
+      <w:r>
+        <w:rPr>
+          <w:rFonts w:ascii="Times New Roman" w:hAnsi="Times New Roman" w:cs="Times New Roman"/>
+        </w:rPr>
+        <w:t>"</w:t>
+      </w:r>
       <w:r>
         <w:rPr>
           <w:rFonts w:ascii="Times New Roman" w:hAnsi="Times New Roman" w:cs="Times New Roman"/>
         </w:rPr>
         <w:t xml:space="preserve"> </w:t>
       </w:r>
-    </w:p>
-    <w:p>
-      <w:pPr>
-        <w:rPr>
-          <w:rFonts w:ascii="Times New Roman" w:hAnsi="Times New Roman" w:cs="Times New Roman"/>
-        </w:rPr>
-      </w:pPr>
-      <w:r>
-        <w:rPr>
-          <w:rFonts w:ascii="Times New Roman" w:hAnsi="Times New Roman" w:cs="Times New Roman"/>
-        </w:rPr>
-        <w:t>Si es 1:</w:t>
-      </w:r>
-    </w:p>
-    <w:p>
-      <w:pPr>
-        <w:rPr>
-          <w:rFonts w:ascii="Times New Roman" w:hAnsi="Times New Roman" w:cs="Times New Roman"/>
-        </w:rPr>
-      </w:pPr>
-      <w:r>
-        <w:rPr>
-          <w:rFonts w:ascii="Times New Roman" w:hAnsi="Times New Roman" w:cs="Times New Roman"/>
-        </w:rPr>
-        <w:t xml:space="preserve"> Subtotal = 0</w:t>
-      </w:r>
-    </w:p>
-    <w:p>
-      <w:pPr>
-        <w:rPr>
-          <w:rFonts w:ascii="Times New Roman" w:hAnsi="Times New Roman" w:cs="Times New Roman"/>
-        </w:rPr>
-      </w:pPr>
-      <w:r>
-        <w:rPr>
-          <w:rFonts w:ascii="Times New Roman" w:hAnsi="Times New Roman" w:cs="Times New Roman"/>
-        </w:rPr>
-        <w:t xml:space="preserve">   Repetir</w:t>
-      </w:r>
-    </w:p>
-    <w:p>
-      <w:pPr>
-        <w:rPr>
-          <w:rFonts w:ascii="Times New Roman" w:hAnsi="Times New Roman" w:cs="Times New Roman"/>
-        </w:rPr>
-      </w:pPr>
-      <w:r>
-        <w:rPr>
-          <w:rFonts w:ascii="Times New Roman" w:hAnsi="Times New Roman" w:cs="Times New Roman"/>
-        </w:rPr>
-        <w:t xml:space="preserve">   Mostrar "Ingrese el precio del producto o 0 para terminar"</w:t>
-      </w:r>
-    </w:p>
-    <w:p>
-      <w:pPr>
-        <w:rPr>
-          <w:rFonts w:ascii="Times New Roman" w:hAnsi="Times New Roman" w:cs="Times New Roman"/>
-        </w:rPr>
-      </w:pPr>
-      <w:r>
-        <w:rPr>
-          <w:rFonts w:ascii="Times New Roman" w:hAnsi="Times New Roman" w:cs="Times New Roman"/>
-        </w:rPr>
-        <w:t xml:space="preserve">   Escribir en precio</w:t>
-      </w:r>
-    </w:p>
-    <w:p>
-      <w:pPr>
-        <w:rPr>
-          <w:rFonts w:ascii="Times New Roman" w:hAnsi="Times New Roman" w:cs="Times New Roman"/>
-        </w:rPr>
-      </w:pPr>
-      <w:r>
-        <w:rPr>
-          <w:rFonts w:ascii="Times New Roman" w:hAnsi="Times New Roman" w:cs="Times New Roman"/>
-        </w:rPr>
-        <w:t xml:space="preserve">   Si precio &lt; 0 Entonces</w:t>
-      </w:r>
-    </w:p>
-    <w:p>
-      <w:pPr>
-        <w:rPr>
-          <w:rFonts w:ascii="Times New Roman" w:hAnsi="Times New Roman" w:cs="Times New Roman"/>
-        </w:rPr>
-      </w:pPr>
-      <w:r>
-        <w:rPr>
-          <w:rFonts w:ascii="Times New Roman" w:hAnsi="Times New Roman" w:cs="Times New Roman"/>
-        </w:rPr>
-        <w:t xml:space="preserve">   Mostrar "Error, ingrese un precio valido"</w:t>
-      </w:r>
-    </w:p>
-    <w:p>
-      <w:pPr>
-        <w:rPr>
-          <w:rFonts w:ascii="Times New Roman" w:hAnsi="Times New Roman" w:cs="Times New Roman"/>
-        </w:rPr>
-      </w:pPr>
-      <w:r>
-        <w:rPr>
-          <w:rFonts w:ascii="Times New Roman" w:hAnsi="Times New Roman" w:cs="Times New Roman"/>
-        </w:rPr>
-        <w:lastRenderedPageBreak/>
-        <w:t xml:space="preserve">     Sino</w:t>
-      </w:r>
-    </w:p>
-    <w:p>
-      <w:pPr>
-        <w:rPr>
-          <w:rFonts w:ascii="Times New Roman" w:hAnsi="Times New Roman" w:cs="Times New Roman"/>
-        </w:rPr>
-      </w:pPr>
-      <w:r>
-        <w:rPr>
-          <w:rFonts w:ascii="Times New Roman" w:hAnsi="Times New Roman" w:cs="Times New Roman"/>
-        </w:rPr>
-        <w:t xml:space="preserve">     Si precio &gt; 0 Entonce</w:t>
-      </w:r>
-      <w:r>
-        <w:rPr>
-          <w:rFonts w:ascii="Times New Roman" w:hAnsi="Times New Roman" w:cs="Times New Roman"/>
-        </w:rPr>
-        <w:t>s</w:t>
-      </w:r>
-    </w:p>
-    <w:p>
-      <w:pPr>
-        <w:rPr>
-          <w:rFonts w:ascii="Times New Roman" w:hAnsi="Times New Roman" w:cs="Times New Roman"/>
-        </w:rPr>
-      </w:pPr>
-      <w:r>
-        <w:rPr>
-          <w:rFonts w:ascii="Times New Roman" w:hAnsi="Times New Roman" w:cs="Times New Roman"/>
-        </w:rPr>
-        <w:t xml:space="preserve">     </w:t>
-      </w:r>
-      <w:proofErr w:type="spellStart"/>
-      <w:r>
-        <w:rPr>
-          <w:rFonts w:ascii="Times New Roman" w:hAnsi="Times New Roman" w:cs="Times New Roman"/>
-        </w:rPr>
-        <w:t>Resumen_precio</w:t>
-      </w:r>
-      <w:proofErr w:type="spellEnd"/>
-      <w:r>
-        <w:rPr>
-          <w:rFonts w:ascii="Times New Roman" w:hAnsi="Times New Roman" w:cs="Times New Roman"/>
-        </w:rPr>
-        <w:t xml:space="preserve"> = </w:t>
-      </w:r>
-      <w:proofErr w:type="spellStart"/>
-      <w:r>
-        <w:rPr>
-          <w:rFonts w:ascii="Times New Roman" w:hAnsi="Times New Roman" w:cs="Times New Roman"/>
-        </w:rPr>
-        <w:t>Resumen_precio</w:t>
-      </w:r>
-      <w:proofErr w:type="spellEnd"/>
-      <w:r>
-        <w:rPr>
-          <w:rFonts w:ascii="Times New Roman" w:hAnsi="Times New Roman" w:cs="Times New Roman"/>
-        </w:rPr>
-        <w:t xml:space="preserve"> + precio    </w:t>
-      </w:r>
-    </w:p>
-    <w:p>
-      <w:pPr>
-        <w:rPr>
-          <w:rFonts w:ascii="Times New Roman" w:hAnsi="Times New Roman" w:cs="Times New Roman"/>
-        </w:rPr>
-      </w:pPr>
-      <w:r>
-        <w:rPr>
-          <w:rFonts w:ascii="Times New Roman" w:hAnsi="Times New Roman" w:cs="Times New Roman"/>
-        </w:rPr>
-        <w:t xml:space="preserve">     Mostrar "Ingrese la cantidad de producto"</w:t>
-      </w:r>
-    </w:p>
-    <w:p>
-      <w:pPr>
-        <w:rPr>
-          <w:rFonts w:ascii="Times New Roman" w:hAnsi="Times New Roman" w:cs="Times New Roman"/>
-        </w:rPr>
-      </w:pPr>
-      <w:r>
-        <w:rPr>
-          <w:rFonts w:ascii="Times New Roman" w:hAnsi="Times New Roman" w:cs="Times New Roman"/>
-        </w:rPr>
-        <w:t xml:space="preserve">     Escribir en Cantidad</w:t>
-      </w:r>
-    </w:p>
-    <w:p>
-      <w:pPr>
-        <w:rPr>
-          <w:rFonts w:ascii="Times New Roman" w:hAnsi="Times New Roman" w:cs="Times New Roman"/>
-        </w:rPr>
-      </w:pPr>
-      <w:r>
-        <w:rPr>
-          <w:rFonts w:ascii="Times New Roman" w:hAnsi="Times New Roman" w:cs="Times New Roman"/>
-        </w:rPr>
-        <w:t xml:space="preserve">     Mientras Cantidad &lt; 1 o Cantidad &gt; 100</w:t>
-      </w:r>
-    </w:p>
-    <w:p>
-      <w:pPr>
-        <w:rPr>
-          <w:rFonts w:ascii="Times New Roman" w:hAnsi="Times New Roman" w:cs="Times New Roman"/>
-        </w:rPr>
-      </w:pPr>
-      <w:r>
-        <w:rPr>
-          <w:rFonts w:ascii="Times New Roman" w:hAnsi="Times New Roman" w:cs="Times New Roman"/>
-        </w:rPr>
-        <w:t xml:space="preserve">     Mostrar "Error, la cantidad debe ser de 1 a 100"</w:t>
-      </w:r>
-    </w:p>
-    <w:p>
-      <w:pPr>
-        <w:rPr>
-          <w:rFonts w:ascii="Times New Roman" w:hAnsi="Times New Roman" w:cs="Times New Roman"/>
-        </w:rPr>
-      </w:pPr>
-      <w:r>
-        <w:rPr>
-          <w:rFonts w:ascii="Times New Roman" w:hAnsi="Times New Roman" w:cs="Times New Roman"/>
-        </w:rPr>
-        <w:t xml:space="preserve">     Mostrar "Ingrese la cantidad de producto"</w:t>
-      </w:r>
-    </w:p>
-    <w:p>
-      <w:pPr>
-        <w:rPr>
-          <w:rFonts w:ascii="Times New Roman" w:hAnsi="Times New Roman" w:cs="Times New Roman"/>
-        </w:rPr>
-      </w:pPr>
-      <w:r>
-        <w:rPr>
-          <w:rFonts w:ascii="Times New Roman" w:hAnsi="Times New Roman" w:cs="Times New Roman"/>
-        </w:rPr>
-        <w:t xml:space="preserve">     Escribir en Cantidad</w:t>
-      </w:r>
-    </w:p>
-    <w:p>
-      <w:pPr>
-        <w:rPr>
-          <w:rFonts w:ascii="Times New Roman" w:hAnsi="Times New Roman" w:cs="Times New Roman"/>
-        </w:rPr>
-      </w:pPr>
-      <w:proofErr w:type="spellStart"/>
-      <w:r>
-        <w:rPr>
-          <w:rFonts w:ascii="Times New Roman" w:hAnsi="Times New Roman" w:cs="Times New Roman"/>
-        </w:rPr>
-        <w:t>FinMientras</w:t>
-      </w:r>
-      <w:proofErr w:type="spellEnd"/>
-    </w:p>
-    <w:p>
-      <w:pPr>
-        <w:rPr>
-          <w:rFonts w:ascii="Times New Roman" w:hAnsi="Times New Roman" w:cs="Times New Roman"/>
-        </w:rPr>
-      </w:pPr>
-      <w:r>
-        <w:rPr>
-          <w:rFonts w:ascii="Times New Roman" w:hAnsi="Times New Roman" w:cs="Times New Roman"/>
-        </w:rPr>
-        <w:t>Subtotal = Subtotal + precio * Cantidad</w:t>
-      </w:r>
-    </w:p>
-    <w:p>
-      <w:pPr>
-        <w:rPr>
-          <w:rFonts w:ascii="Times New Roman" w:hAnsi="Times New Roman" w:cs="Times New Roman"/>
-        </w:rPr>
-      </w:pPr>
-      <w:r>
-        <w:rPr>
-          <w:rFonts w:ascii="Times New Roman" w:hAnsi="Times New Roman" w:cs="Times New Roman"/>
-        </w:rPr>
-        <w:t xml:space="preserve">Mostrar "El subtotal es: ", Subtotal             </w:t>
-      </w:r>
-    </w:p>
-    <w:p>
-      <w:pPr>
-        <w:rPr>
-          <w:rFonts w:ascii="Times New Roman" w:hAnsi="Times New Roman" w:cs="Times New Roman"/>
-        </w:rPr>
-      </w:pPr>
-      <w:proofErr w:type="spellStart"/>
-      <w:r>
-        <w:rPr>
-          <w:rFonts w:ascii="Times New Roman" w:hAnsi="Times New Roman" w:cs="Times New Roman"/>
-        </w:rPr>
-        <w:t>FinSi</w:t>
-      </w:r>
-      <w:proofErr w:type="spellEnd"/>
-    </w:p>
-    <w:p>
-      <w:pPr>
-        <w:rPr>
-          <w:rFonts w:ascii="Times New Roman" w:hAnsi="Times New Roman" w:cs="Times New Roman"/>
-        </w:rPr>
-      </w:pPr>
-      <w:proofErr w:type="spellStart"/>
-      <w:r>
-        <w:rPr>
-          <w:rFonts w:ascii="Times New Roman" w:hAnsi="Times New Roman" w:cs="Times New Roman"/>
-        </w:rPr>
-        <w:t>FinSi</w:t>
-      </w:r>
-      <w:proofErr w:type="spellEnd"/>
-    </w:p>
-    <w:p>
-      <w:pPr>
-        <w:rPr>
-          <w:rFonts w:ascii="Times New Roman" w:hAnsi="Times New Roman" w:cs="Times New Roman"/>
-        </w:rPr>
-      </w:pPr>
-      <w:r>
-        <w:rPr>
-          <w:rFonts w:ascii="Times New Roman" w:hAnsi="Times New Roman" w:cs="Times New Roman"/>
-        </w:rPr>
-        <w:t>Hasta que precio = 0</w:t>
-      </w:r>
-    </w:p>
-    <w:p>
-      <w:pPr>
-        <w:rPr>
-          <w:rFonts w:ascii="Times New Roman" w:hAnsi="Times New Roman" w:cs="Times New Roman"/>
-        </w:rPr>
-      </w:pPr>
+      <w:r>
+        <w:rPr>
+          <w:rFonts w:ascii="Times New Roman" w:hAnsi="Times New Roman" w:cs="Times New Roman"/>
+        </w:rPr>
+        <w:t>Total</w:t>
+      </w:r>
+    </w:p>
+    <w:p>
+      <w:pPr>
+        <w:rPr>
+          <w:rFonts w:ascii="Times New Roman" w:hAnsi="Times New Roman" w:cs="Times New Roman"/>
+        </w:rPr>
+      </w:pPr>
+      <w:r>
+        <w:rPr>
+          <w:rFonts w:ascii="Times New Roman" w:hAnsi="Times New Roman" w:cs="Times New Roman"/>
+        </w:rPr>
+        <w:t>Pago = 0</w:t>
+      </w:r>
+    </w:p>
+    <w:p>
+      <w:pPr>
+        <w:rPr>
+          <w:rFonts w:ascii="Times New Roman" w:hAnsi="Times New Roman" w:cs="Times New Roman"/>
+        </w:rPr>
+      </w:pPr>
+      <w:r>
+        <w:rPr>
+          <w:rFonts w:ascii="Times New Roman" w:hAnsi="Times New Roman" w:cs="Times New Roman"/>
+        </w:rPr>
+        <w:t>Repetir</w:t>
+      </w:r>
+    </w:p>
+    <w:p>
+      <w:pPr>
+        <w:rPr>
+          <w:rFonts w:ascii="Times New Roman" w:hAnsi="Times New Roman" w:cs="Times New Roman"/>
+        </w:rPr>
+      </w:pPr>
+      <w:r>
+        <w:rPr>
+          <w:rFonts w:ascii="Times New Roman" w:hAnsi="Times New Roman" w:cs="Times New Roman"/>
+        </w:rPr>
+        <w:t xml:space="preserve">Mostrar </w:t>
+      </w:r>
+      <w:r>
+        <w:rPr>
+          <w:rFonts w:ascii="Times New Roman" w:hAnsi="Times New Roman" w:cs="Times New Roman"/>
+        </w:rPr>
+        <w:t>"</w:t>
+      </w:r>
+      <w:r>
+        <w:rPr>
+          <w:rFonts w:ascii="Times New Roman" w:hAnsi="Times New Roman" w:cs="Times New Roman"/>
+        </w:rPr>
+        <w:t>Ingrese el pago hecho por el cliente</w:t>
+      </w:r>
+      <w:r>
+        <w:rPr>
+          <w:rFonts w:ascii="Times New Roman" w:hAnsi="Times New Roman" w:cs="Times New Roman"/>
+        </w:rPr>
+        <w:t>"</w:t>
+      </w:r>
+    </w:p>
+    <w:p>
+      <w:pPr>
+        <w:rPr>
+          <w:rFonts w:ascii="Times New Roman" w:hAnsi="Times New Roman" w:cs="Times New Roman"/>
+        </w:rPr>
+      </w:pPr>
+      <w:r>
+        <w:rPr>
+          <w:rFonts w:ascii="Times New Roman" w:hAnsi="Times New Roman" w:cs="Times New Roman"/>
+        </w:rPr>
+        <w:t xml:space="preserve">Escribir en pago </w:t>
+      </w:r>
+    </w:p>
+    <w:p>
+      <w:pPr>
+        <w:rPr>
+          <w:rFonts w:ascii="Times New Roman" w:hAnsi="Times New Roman" w:cs="Times New Roman"/>
+        </w:rPr>
+      </w:pPr>
+      <w:r>
+        <w:rPr>
+          <w:rFonts w:ascii="Times New Roman" w:hAnsi="Times New Roman" w:cs="Times New Roman"/>
+        </w:rPr>
+        <w:t xml:space="preserve">Si pago es &lt; a Total </w:t>
+      </w:r>
+      <w:r>
+        <w:rPr>
+          <w:rFonts w:ascii="Times New Roman" w:hAnsi="Times New Roman" w:cs="Times New Roman"/>
+        </w:rPr>
+        <w:t>Entonces</w:t>
+      </w:r>
+    </w:p>
+    <w:p>
+      <w:pPr>
+        <w:rPr>
+          <w:rFonts w:ascii="Times New Roman" w:hAnsi="Times New Roman" w:cs="Times New Roman"/>
+        </w:rPr>
+      </w:pPr>
+      <w:r>
+        <w:rPr>
+          <w:rFonts w:ascii="Times New Roman" w:hAnsi="Times New Roman" w:cs="Times New Roman"/>
+        </w:rPr>
+        <w:t xml:space="preserve">Mostrar </w:t>
+      </w:r>
+      <w:r>
+        <w:rPr>
+          <w:rFonts w:ascii="Times New Roman" w:hAnsi="Times New Roman" w:cs="Times New Roman"/>
+        </w:rPr>
+        <w:t>"</w:t>
+      </w:r>
+      <w:r>
+        <w:rPr>
+          <w:rFonts w:ascii="Times New Roman" w:hAnsi="Times New Roman" w:cs="Times New Roman"/>
+        </w:rPr>
+        <w:t>Ingrese el monto correcto a pagar</w:t>
+      </w:r>
+      <w:r>
+        <w:rPr>
+          <w:rFonts w:ascii="Times New Roman" w:hAnsi="Times New Roman" w:cs="Times New Roman"/>
+        </w:rPr>
+        <w:t>"</w:t>
+      </w:r>
+    </w:p>
+    <w:p>
+      <w:pPr>
+        <w:rPr>
+          <w:rFonts w:ascii="Times New Roman" w:hAnsi="Times New Roman" w:cs="Times New Roman"/>
+        </w:rPr>
+      </w:pPr>
+      <w:r>
+        <w:rPr>
+          <w:rFonts w:ascii="Times New Roman" w:hAnsi="Times New Roman" w:cs="Times New Roman"/>
+        </w:rPr>
+        <w:t>Finsi</w:t>
+      </w:r>
+    </w:p>
+    <w:p>
+      <w:pPr>
+        <w:rPr>
+          <w:rFonts w:ascii="Times New Roman" w:hAnsi="Times New Roman" w:cs="Times New Roman"/>
+        </w:rPr>
+      </w:pPr>
+      <w:r>
+        <w:rPr>
+          <w:rFonts w:ascii="Times New Roman" w:hAnsi="Times New Roman" w:cs="Times New Roman"/>
+        </w:rPr>
+        <w:t>Hasta que pago &gt;</w:t>
+      </w:r>
+      <w:r>
+        <w:rPr>
+          <w:rFonts w:ascii="Times New Roman" w:hAnsi="Times New Roman" w:cs="Times New Roman"/>
+        </w:rPr>
+        <w:t>=</w:t>
+      </w:r>
       <w:r>
         <w:rPr>
           <w:rFonts w:ascii="Times New Roman" w:hAnsi="Times New Roman" w:cs="Times New Roman"/>
         </w:rPr>
         <w:t xml:space="preserve"> </w:t>
       </w:r>
+      <w:r>
+        <w:rPr>
+          <w:rFonts w:ascii="Times New Roman" w:hAnsi="Times New Roman" w:cs="Times New Roman"/>
+        </w:rPr>
+        <w:t>Total</w:t>
+      </w:r>
+      <w:r>
+        <w:rPr>
+          <w:rFonts w:ascii="Times New Roman" w:hAnsi="Times New Roman" w:cs="Times New Roman"/>
+        </w:rPr>
+        <w:t xml:space="preserve"> </w:t>
+      </w:r>
+    </w:p>
+    <w:p>
+      <w:pPr>
+        <w:rPr>
+          <w:rFonts w:ascii="Times New Roman" w:hAnsi="Times New Roman" w:cs="Times New Roman"/>
+        </w:rPr>
+      </w:pPr>
+      <w:r>
+        <w:rPr>
+          <w:rFonts w:ascii="Times New Roman" w:hAnsi="Times New Roman" w:cs="Times New Roman"/>
+        </w:rPr>
+        <w:t>Cambio = Pago - Total</w:t>
+      </w:r>
+    </w:p>
+    <w:p>
+      <w:pPr>
+        <w:rPr>
+          <w:rFonts w:ascii="Times New Roman" w:hAnsi="Times New Roman" w:cs="Times New Roman"/>
+        </w:rPr>
+      </w:pPr>
+    </w:p>
+    <w:p>
+      <w:pPr>
+        <w:rPr>
+          <w:rFonts w:ascii="Times New Roman" w:hAnsi="Times New Roman" w:cs="Times New Roman"/>
+        </w:rPr>
+      </w:pPr>
+      <w:r>
+        <w:rPr>
+          <w:rFonts w:ascii="Times New Roman" w:hAnsi="Times New Roman" w:cs="Times New Roman"/>
+        </w:rPr>
+        <w:t>Mostrar "RECIBO"</w:t>
+      </w:r>
+    </w:p>
+    <w:p>
+      <w:pPr>
+        <w:rPr>
+          <w:rFonts w:ascii="Times New Roman" w:hAnsi="Times New Roman" w:cs="Times New Roman"/>
+        </w:rPr>
+      </w:pPr>
+      <w:r>
+        <w:rPr>
+          <w:rFonts w:ascii="Times New Roman" w:hAnsi="Times New Roman" w:cs="Times New Roman"/>
+        </w:rPr>
+        <w:t>Mostrar "Subtotal: ", Subtotal + Descuento</w:t>
+      </w:r>
+    </w:p>
+    <w:p>
+      <w:pPr>
+        <w:rPr>
+          <w:rFonts w:ascii="Times New Roman" w:hAnsi="Times New Roman" w:cs="Times New Roman"/>
+        </w:rPr>
+      </w:pPr>
+      <w:r>
+        <w:rPr>
+          <w:rFonts w:ascii="Times New Roman" w:hAnsi="Times New Roman" w:cs="Times New Roman"/>
+        </w:rPr>
+        <w:t>Mostrar "Descuento: " Descuento</w:t>
+      </w:r>
+    </w:p>
+    <w:p>
+      <w:pPr>
+        <w:rPr>
+          <w:rFonts w:ascii="Times New Roman" w:hAnsi="Times New Roman" w:cs="Times New Roman"/>
+        </w:rPr>
+      </w:pPr>
+      <w:r>
+        <w:rPr>
+          <w:rFonts w:ascii="Times New Roman" w:hAnsi="Times New Roman" w:cs="Times New Roman"/>
+        </w:rPr>
+        <w:t>Mostrar "Subtotal con descuento: "</w:t>
+      </w:r>
+      <w:r>
+        <w:rPr>
+          <w:rFonts w:ascii="Times New Roman" w:hAnsi="Times New Roman" w:cs="Times New Roman"/>
+        </w:rPr>
+        <w:t xml:space="preserve"> </w:t>
+      </w:r>
+      <w:r>
+        <w:rPr>
+          <w:rFonts w:ascii="Times New Roman" w:hAnsi="Times New Roman" w:cs="Times New Roman"/>
+        </w:rPr>
+        <w:t>, Subtotal</w:t>
+      </w:r>
+    </w:p>
+    <w:p>
+      <w:pPr>
+        <w:rPr>
+          <w:rFonts w:ascii="Times New Roman" w:hAnsi="Times New Roman" w:cs="Times New Roman"/>
+        </w:rPr>
+      </w:pPr>
+      <w:r>
+        <w:rPr>
+          <w:rFonts w:ascii="Times New Roman" w:hAnsi="Times New Roman" w:cs="Times New Roman"/>
+        </w:rPr>
+        <w:t>Mostrar "IVA (12%): "</w:t>
+      </w:r>
+      <w:r>
+        <w:rPr>
+          <w:rFonts w:ascii="Times New Roman" w:hAnsi="Times New Roman" w:cs="Times New Roman"/>
+        </w:rPr>
+        <w:t xml:space="preserve"> </w:t>
+      </w:r>
+      <w:r>
+        <w:rPr>
+          <w:rFonts w:ascii="Times New Roman" w:hAnsi="Times New Roman" w:cs="Times New Roman"/>
+        </w:rPr>
+        <w:t>,</w:t>
+      </w:r>
+      <w:r>
+        <w:rPr>
+          <w:rFonts w:ascii="Times New Roman" w:hAnsi="Times New Roman" w:cs="Times New Roman"/>
+        </w:rPr>
+        <w:t xml:space="preserve"> </w:t>
+      </w:r>
+      <w:r>
+        <w:rPr>
+          <w:rFonts w:ascii="Times New Roman" w:hAnsi="Times New Roman" w:cs="Times New Roman"/>
+        </w:rPr>
+        <w:t xml:space="preserve"> IVA</w:t>
+      </w:r>
+    </w:p>
+    <w:p>
+      <w:pPr>
+        <w:rPr>
+          <w:rFonts w:ascii="Times New Roman" w:hAnsi="Times New Roman" w:cs="Times New Roman"/>
+        </w:rPr>
+      </w:pPr>
+      <w:r>
+        <w:rPr>
+          <w:rFonts w:ascii="Times New Roman" w:hAnsi="Times New Roman" w:cs="Times New Roman"/>
+        </w:rPr>
+        <w:t>Mostrar "Total: "</w:t>
+      </w:r>
+      <w:r>
+        <w:rPr>
+          <w:rFonts w:ascii="Times New Roman" w:hAnsi="Times New Roman" w:cs="Times New Roman"/>
+        </w:rPr>
+        <w:t xml:space="preserve"> </w:t>
+      </w:r>
+      <w:r>
+        <w:rPr>
+          <w:rFonts w:ascii="Times New Roman" w:hAnsi="Times New Roman" w:cs="Times New Roman"/>
+        </w:rPr>
+        <w:t>, Total</w:t>
+      </w:r>
+    </w:p>
+    <w:p>
+      <w:pPr>
+        <w:rPr>
+          <w:rFonts w:ascii="Times New Roman" w:hAnsi="Times New Roman" w:cs="Times New Roman"/>
+        </w:rPr>
+      </w:pPr>
+      <w:r>
+        <w:rPr>
+          <w:rFonts w:ascii="Times New Roman" w:hAnsi="Times New Roman" w:cs="Times New Roman"/>
+        </w:rPr>
+        <w:t>Mostrar "Pago: "</w:t>
+      </w:r>
+      <w:r>
+        <w:rPr>
+          <w:rFonts w:ascii="Times New Roman" w:hAnsi="Times New Roman" w:cs="Times New Roman"/>
+        </w:rPr>
+        <w:t xml:space="preserve"> </w:t>
+      </w:r>
+      <w:r>
+        <w:rPr>
+          <w:rFonts w:ascii="Times New Roman" w:hAnsi="Times New Roman" w:cs="Times New Roman"/>
+        </w:rPr>
+        <w:t>, Pago</w:t>
+      </w:r>
+    </w:p>
+    <w:p>
+      <w:pPr>
+        <w:rPr>
+          <w:rFonts w:ascii="Times New Roman" w:hAnsi="Times New Roman" w:cs="Times New Roman"/>
+        </w:rPr>
+      </w:pPr>
+      <w:r>
+        <w:rPr>
+          <w:rFonts w:ascii="Times New Roman" w:hAnsi="Times New Roman" w:cs="Times New Roman"/>
+        </w:rPr>
+        <w:t>Mostrar "Cambio: ", Cambio</w:t>
+      </w:r>
+    </w:p>
+    <w:p>
+      <w:pPr>
+        <w:rPr>
+          <w:rFonts w:ascii="Times New Roman" w:hAnsi="Times New Roman" w:cs="Times New Roman"/>
+        </w:rPr>
+      </w:pPr>
+      <w:r>
+        <w:rPr>
+          <w:rFonts w:ascii="Times New Roman" w:hAnsi="Times New Roman" w:cs="Times New Roman"/>
+        </w:rPr>
+        <w:t>Mostrar "Gracias por su compra"</w:t>
+      </w:r>
+    </w:p>
+    <w:p>
+      <w:pPr>
+        <w:rPr>
+          <w:rFonts w:ascii="Times New Roman" w:hAnsi="Times New Roman" w:cs="Times New Roman"/>
+        </w:rPr>
+      </w:pPr>
+      <w:r>
+        <w:rPr>
+          <w:rFonts w:ascii="Times New Roman" w:hAnsi="Times New Roman" w:cs="Times New Roman"/>
+        </w:rPr>
+        <w:t xml:space="preserve">Sino </w:t>
+      </w:r>
+    </w:p>
+    <w:p>
+      <w:pPr>
+        <w:rPr>
+          <w:rFonts w:ascii="Times New Roman" w:hAnsi="Times New Roman" w:cs="Times New Roman"/>
+        </w:rPr>
+      </w:pPr>
+      <w:r>
+        <w:rPr>
+          <w:rFonts w:ascii="Times New Roman" w:hAnsi="Times New Roman" w:cs="Times New Roman"/>
+        </w:rPr>
+        <w:t xml:space="preserve">Mostrar </w:t>
+      </w:r>
+      <w:r>
+        <w:rPr>
+          <w:rFonts w:ascii="Times New Roman" w:hAnsi="Times New Roman" w:cs="Times New Roman"/>
+        </w:rPr>
+        <w:t>"</w:t>
+      </w:r>
+      <w:r>
+        <w:rPr>
+          <w:rFonts w:ascii="Times New Roman" w:hAnsi="Times New Roman" w:cs="Times New Roman"/>
+        </w:rPr>
+        <w:t>No se registraron ventas</w:t>
+      </w:r>
+      <w:r>
+        <w:rPr>
+          <w:rFonts w:ascii="Times New Roman" w:hAnsi="Times New Roman" w:cs="Times New Roman"/>
+        </w:rPr>
+        <w:t>"</w:t>
+      </w:r>
+    </w:p>
+    <w:p>
+      <w:pPr>
+        <w:rPr>
+          <w:rFonts w:ascii="Times New Roman" w:hAnsi="Times New Roman" w:cs="Times New Roman"/>
+        </w:rPr>
+      </w:pPr>
+      <w:r>
+        <w:rPr>
+          <w:rFonts w:ascii="Times New Roman" w:hAnsi="Times New Roman" w:cs="Times New Roman"/>
+        </w:rPr>
+        <w:t>Finsi</w:t>
+      </w:r>
+    </w:p>
+    <w:p>
+      <w:pPr>
+        <w:rPr>
+          <w:rFonts w:ascii="Times New Roman" w:hAnsi="Times New Roman" w:cs="Times New Roman"/>
+        </w:rPr>
+      </w:pPr>
     </w:p>
     <w:p>
       <w:pPr>
@@ -1230,21 +1857,7 @@
         <w:rPr>
           <w:rFonts w:ascii="Times New Roman" w:hAnsi="Times New Roman" w:cs="Times New Roman"/>
         </w:rPr>
-        <w:t xml:space="preserve">  Mostrar "Precio del producto: ", </w:t>
-      </w:r>
-      <w:proofErr w:type="spellStart"/>
-      <w:r>
-        <w:rPr>
-          <w:rFonts w:ascii="Times New Roman" w:hAnsi="Times New Roman" w:cs="Times New Roman"/>
-        </w:rPr>
-        <w:t>Resumen_precio</w:t>
-      </w:r>
-      <w:proofErr w:type="spellEnd"/>
-      <w:r>
-        <w:rPr>
-          <w:rFonts w:ascii="Times New Roman" w:hAnsi="Times New Roman" w:cs="Times New Roman"/>
-        </w:rPr>
-        <w:t xml:space="preserve">   </w:t>
+        <w:t xml:space="preserve">  Mostrar "Precio del producto: ", Resumen_precio   </w:t>
       </w:r>
     </w:p>
     <w:p>
@@ -1344,26 +1957,23 @@
           <w:rFonts w:ascii="Times New Roman" w:hAnsi="Times New Roman" w:cs="Times New Roman"/>
         </w:rPr>
       </w:pPr>
-      <w:proofErr w:type="spellStart"/>
       <w:r>
         <w:rPr>
           <w:rFonts w:ascii="Times New Roman" w:hAnsi="Times New Roman" w:cs="Times New Roman"/>
         </w:rPr>
         <w:t>FinCambiar</w:t>
       </w:r>
-      <w:proofErr w:type="spellEnd"/>
-    </w:p>
-    <w:p>
-      <w:pPr>
-        <w:rPr>
-          <w:rFonts w:ascii="Times New Roman" w:hAnsi="Times New Roman" w:cs="Times New Roman"/>
-        </w:rPr>
-      </w:pPr>
-      <w:r>
-        <w:rPr>
-          <w:rFonts w:ascii="Times New Roman" w:hAnsi="Times New Roman" w:cs="Times New Roman"/>
-        </w:rPr>
-        <w:lastRenderedPageBreak/>
+    </w:p>
+    <w:p>
+      <w:pPr>
+        <w:rPr>
+          <w:rFonts w:ascii="Times New Roman" w:hAnsi="Times New Roman" w:cs="Times New Roman"/>
+        </w:rPr>
+      </w:pPr>
+      <w:r>
+        <w:rPr>
+          <w:rFonts w:ascii="Times New Roman" w:hAnsi="Times New Roman" w:cs="Times New Roman"/>
+        </w:rPr>
         <w:t>Hasta que Menú = 3</w:t>
       </w:r>
     </w:p>
@@ -2398,7 +3008,6 @@
     <w:next w:val="Normal"/>
     <w:link w:val="Ttulo2Car"/>
     <w:uiPriority w:val="9"/>
-    <w:semiHidden/>
     <w:unhideWhenUsed/>
     <w:qFormat/>
     <w:rsid w:val="00324254"/>
@@ -2614,7 +3223,6 @@
     <w:basedOn w:val="Fuentedeprrafopredeter"/>
     <w:link w:val="Ttulo2"/>
     <w:uiPriority w:val="9"/>
-    <w:semiHidden/>
     <w:rsid w:val="00324254"/>
     <w:rPr>
       <w:rFonts w:asciiTheme="majorHAnsi" w:eastAsiaTheme="majorEastAsia" w:hAnsiTheme="majorHAnsi" w:cstheme="majorBidi"/>

</xml_diff>

<commit_message>
Version Final del Pseudocodigo con el resumen del dia añadido
</commit_message>
<xml_diff>
--- a/docs/Analisis y Pseudocodigo.docx
+++ b/docs/Analisis y Pseudocodigo.docx
@@ -469,11 +469,19 @@
         </w:rPr>
         <w:t xml:space="preserve">Se muestra el resumen del </w:t>
       </w:r>
-      <w:r>
-        <w:rPr>
-          <w:rFonts w:ascii="Times New Roman" w:hAnsi="Times New Roman" w:cs="Times New Roman"/>
-        </w:rPr>
-        <w:t xml:space="preserve">día así como también un mensaje de error si se solicita sin haber ventas </w:t>
+      <w:proofErr w:type="gramStart"/>
+      <w:r>
+        <w:rPr>
+          <w:rFonts w:ascii="Times New Roman" w:hAnsi="Times New Roman" w:cs="Times New Roman"/>
+        </w:rPr>
+        <w:t>día</w:t>
+      </w:r>
+      <w:proofErr w:type="gramEnd"/>
+      <w:r>
+        <w:rPr>
+          <w:rFonts w:ascii="Times New Roman" w:hAnsi="Times New Roman" w:cs="Times New Roman"/>
+        </w:rPr>
+        <w:t xml:space="preserve"> así como también un mensaje de error si se solicita sin haber ventas </w:t>
       </w:r>
     </w:p>
     <w:p>
@@ -592,19 +600,6 @@
         <w:rPr>
           <w:rFonts w:ascii="Times New Roman" w:hAnsi="Times New Roman" w:cs="Times New Roman"/>
         </w:rPr>
-        <w:t>Definir Contador_Ventas como Entero</w:t>
-      </w:r>
-    </w:p>
-    <w:p>
-      <w:pPr>
-        <w:rPr>
-          <w:rFonts w:ascii="Times New Roman" w:hAnsi="Times New Roman" w:cs="Times New Roman"/>
-        </w:rPr>
-      </w:pPr>
-      <w:r>
-        <w:rPr>
-          <w:rFonts w:ascii="Times New Roman" w:hAnsi="Times New Roman" w:cs="Times New Roman"/>
-        </w:rPr>
         <w:t>Definir precio como Real</w:t>
       </w:r>
     </w:p>
@@ -644,19 +639,6 @@
         <w:rPr>
           <w:rFonts w:ascii="Times New Roman" w:hAnsi="Times New Roman" w:cs="Times New Roman"/>
         </w:rPr>
-        <w:t xml:space="preserve">Definir Resumen_precio como Real            </w:t>
-      </w:r>
-    </w:p>
-    <w:p>
-      <w:pPr>
-        <w:rPr>
-          <w:rFonts w:ascii="Times New Roman" w:hAnsi="Times New Roman" w:cs="Times New Roman"/>
-        </w:rPr>
-      </w:pPr>
-      <w:r>
-        <w:rPr>
-          <w:rFonts w:ascii="Times New Roman" w:hAnsi="Times New Roman" w:cs="Times New Roman"/>
-        </w:rPr>
         <w:t xml:space="preserve">Definir Descuento como </w:t>
       </w:r>
       <w:r>
@@ -740,46 +722,371 @@
         <w:rPr>
           <w:rFonts w:ascii="Times New Roman" w:hAnsi="Times New Roman" w:cs="Times New Roman"/>
         </w:rPr>
+        <w:t xml:space="preserve">Definir </w:t>
+      </w:r>
+      <w:proofErr w:type="spellStart"/>
+      <w:r>
+        <w:rPr>
+          <w:rFonts w:ascii="Times New Roman" w:hAnsi="Times New Roman" w:cs="Times New Roman"/>
+        </w:rPr>
+        <w:t>Total_Vendido</w:t>
+      </w:r>
+      <w:proofErr w:type="spellEnd"/>
+      <w:r>
+        <w:rPr>
+          <w:rFonts w:ascii="Times New Roman" w:hAnsi="Times New Roman" w:cs="Times New Roman"/>
+        </w:rPr>
+        <w:t xml:space="preserve"> como Real</w:t>
+      </w:r>
+    </w:p>
+    <w:p>
+      <w:pPr>
+        <w:rPr>
+          <w:rFonts w:ascii="Times New Roman" w:hAnsi="Times New Roman" w:cs="Times New Roman"/>
+        </w:rPr>
+      </w:pPr>
+      <w:r>
+        <w:rPr>
+          <w:rFonts w:ascii="Times New Roman" w:hAnsi="Times New Roman" w:cs="Times New Roman"/>
+        </w:rPr>
+        <w:t>Definir</w:t>
+      </w:r>
+      <w:r>
+        <w:rPr>
+          <w:rFonts w:ascii="Times New Roman" w:hAnsi="Times New Roman" w:cs="Times New Roman"/>
+        </w:rPr>
+        <w:t xml:space="preserve"> </w:t>
+      </w:r>
+      <w:proofErr w:type="spellStart"/>
+      <w:r>
+        <w:rPr>
+          <w:rFonts w:ascii="Times New Roman" w:hAnsi="Times New Roman" w:cs="Times New Roman"/>
+        </w:rPr>
+        <w:t>Venta_Mayor</w:t>
+      </w:r>
+      <w:proofErr w:type="spellEnd"/>
+      <w:r>
+        <w:rPr>
+          <w:rFonts w:ascii="Times New Roman" w:hAnsi="Times New Roman" w:cs="Times New Roman"/>
+        </w:rPr>
+        <w:t xml:space="preserve"> como Real</w:t>
+      </w:r>
+    </w:p>
+    <w:p>
+      <w:pPr>
+        <w:rPr>
+          <w:rFonts w:ascii="Times New Roman" w:hAnsi="Times New Roman" w:cs="Times New Roman"/>
+        </w:rPr>
+      </w:pPr>
+      <w:r>
+        <w:rPr>
+          <w:rFonts w:ascii="Times New Roman" w:hAnsi="Times New Roman" w:cs="Times New Roman"/>
+        </w:rPr>
+        <w:t>Definir</w:t>
+      </w:r>
+      <w:r>
+        <w:rPr>
+          <w:rFonts w:ascii="Times New Roman" w:hAnsi="Times New Roman" w:cs="Times New Roman"/>
+        </w:rPr>
+        <w:t xml:space="preserve"> </w:t>
+      </w:r>
+      <w:proofErr w:type="spellStart"/>
+      <w:r>
+        <w:rPr>
+          <w:rFonts w:ascii="Times New Roman" w:hAnsi="Times New Roman" w:cs="Times New Roman"/>
+        </w:rPr>
+        <w:t>Venta_Menor</w:t>
+      </w:r>
+      <w:proofErr w:type="spellEnd"/>
+      <w:r>
+        <w:rPr>
+          <w:rFonts w:ascii="Times New Roman" w:hAnsi="Times New Roman" w:cs="Times New Roman"/>
+        </w:rPr>
+        <w:t xml:space="preserve"> como Real</w:t>
+      </w:r>
+    </w:p>
+    <w:p>
+      <w:pPr>
+        <w:rPr>
+          <w:rFonts w:ascii="Times New Roman" w:hAnsi="Times New Roman" w:cs="Times New Roman"/>
+        </w:rPr>
+      </w:pPr>
+      <w:r>
+        <w:rPr>
+          <w:rFonts w:ascii="Times New Roman" w:hAnsi="Times New Roman" w:cs="Times New Roman"/>
+        </w:rPr>
+        <w:t>Definir</w:t>
+      </w:r>
+      <w:r>
+        <w:rPr>
+          <w:rFonts w:ascii="Times New Roman" w:hAnsi="Times New Roman" w:cs="Times New Roman"/>
+        </w:rPr>
+        <w:t xml:space="preserve"> </w:t>
+      </w:r>
+      <w:proofErr w:type="spellStart"/>
+      <w:r>
+        <w:rPr>
+          <w:rFonts w:ascii="Times New Roman" w:hAnsi="Times New Roman" w:cs="Times New Roman"/>
+        </w:rPr>
+        <w:t>Total_Descuentos</w:t>
+      </w:r>
+      <w:proofErr w:type="spellEnd"/>
+      <w:r>
+        <w:rPr>
+          <w:rFonts w:ascii="Times New Roman" w:hAnsi="Times New Roman" w:cs="Times New Roman"/>
+        </w:rPr>
+        <w:t xml:space="preserve"> como Real</w:t>
+      </w:r>
+    </w:p>
+    <w:p>
+      <w:pPr>
+        <w:rPr>
+          <w:rFonts w:ascii="Times New Roman" w:hAnsi="Times New Roman" w:cs="Times New Roman"/>
+        </w:rPr>
+      </w:pPr>
+      <w:r>
+        <w:rPr>
+          <w:rFonts w:ascii="Times New Roman" w:hAnsi="Times New Roman" w:cs="Times New Roman"/>
+        </w:rPr>
+        <w:t xml:space="preserve">Definir </w:t>
+      </w:r>
+      <w:proofErr w:type="spellStart"/>
+      <w:r>
+        <w:rPr>
+          <w:rFonts w:ascii="Times New Roman" w:hAnsi="Times New Roman" w:cs="Times New Roman"/>
+        </w:rPr>
+        <w:t>Contador_Ventas</w:t>
+      </w:r>
+      <w:proofErr w:type="spellEnd"/>
+      <w:r>
+        <w:rPr>
+          <w:rFonts w:ascii="Times New Roman" w:hAnsi="Times New Roman" w:cs="Times New Roman"/>
+        </w:rPr>
+        <w:t xml:space="preserve"> como Entero</w:t>
+      </w:r>
+    </w:p>
+    <w:p>
+      <w:pPr>
+        <w:rPr>
+          <w:rFonts w:ascii="Times New Roman" w:hAnsi="Times New Roman" w:cs="Times New Roman"/>
+        </w:rPr>
+      </w:pPr>
+      <w:r>
+        <w:rPr>
+          <w:rFonts w:ascii="Times New Roman" w:hAnsi="Times New Roman" w:cs="Times New Roman"/>
+        </w:rPr>
+        <w:t xml:space="preserve">Definir </w:t>
+      </w:r>
+      <w:proofErr w:type="spellStart"/>
+      <w:r>
+        <w:rPr>
+          <w:rFonts w:ascii="Times New Roman" w:hAnsi="Times New Roman" w:cs="Times New Roman"/>
+        </w:rPr>
+        <w:t>Promediov</w:t>
+      </w:r>
+      <w:proofErr w:type="spellEnd"/>
+      <w:r>
+        <w:rPr>
+          <w:rFonts w:ascii="Times New Roman" w:hAnsi="Times New Roman" w:cs="Times New Roman"/>
+        </w:rPr>
+        <w:t xml:space="preserve"> como Real</w:t>
+      </w:r>
+    </w:p>
+    <w:p>
+      <w:pPr>
+        <w:rPr>
+          <w:rFonts w:ascii="Times New Roman" w:hAnsi="Times New Roman" w:cs="Times New Roman"/>
+        </w:rPr>
+      </w:pPr>
+    </w:p>
+    <w:p>
+      <w:pPr>
+        <w:rPr>
+          <w:rFonts w:ascii="Times New Roman" w:hAnsi="Times New Roman" w:cs="Times New Roman"/>
+        </w:rPr>
+      </w:pPr>
+      <w:r>
+        <w:rPr>
+          <w:rFonts w:ascii="Times New Roman" w:hAnsi="Times New Roman" w:cs="Times New Roman"/>
+        </w:rPr>
         <w:t>Inicio</w:t>
       </w:r>
     </w:p>
     <w:p>
-      <w:pPr>
-        <w:rPr>
-          <w:rFonts w:ascii="Times New Roman" w:hAnsi="Times New Roman" w:cs="Times New Roman"/>
-        </w:rPr>
-      </w:pPr>
-      <w:r>
-        <w:rPr>
-          <w:rFonts w:ascii="Times New Roman" w:hAnsi="Times New Roman" w:cs="Times New Roman"/>
-        </w:rPr>
-        <w:t xml:space="preserve">Contador_Ventas = 0 </w:t>
-      </w:r>
-    </w:p>
-    <w:p>
-      <w:pPr>
-        <w:rPr>
-          <w:rFonts w:ascii="Times New Roman" w:hAnsi="Times New Roman" w:cs="Times New Roman"/>
-        </w:rPr>
-      </w:pPr>
-      <w:r>
-        <w:rPr>
-          <w:rFonts w:ascii="Times New Roman" w:hAnsi="Times New Roman" w:cs="Times New Roman"/>
-        </w:rPr>
-        <w:t xml:space="preserve"> Repetir</w:t>
-      </w:r>
-    </w:p>
-    <w:p>
-      <w:pPr>
-        <w:rPr>
-          <w:rFonts w:ascii="Times New Roman" w:hAnsi="Times New Roman" w:cs="Times New Roman"/>
-        </w:rPr>
-      </w:pPr>
-      <w:r>
-        <w:rPr>
-          <w:rFonts w:ascii="Times New Roman" w:hAnsi="Times New Roman" w:cs="Times New Roman"/>
-        </w:rPr>
-        <w:t xml:space="preserve">  Mostrar "Buen dia, Que desea hacer?"           </w:t>
+      <w:proofErr w:type="spellStart"/>
+      <w:r>
+        <w:rPr>
+          <w:rFonts w:ascii="Times New Roman" w:hAnsi="Times New Roman" w:cs="Times New Roman"/>
+        </w:rPr>
+        <w:t>Total_Vendido</w:t>
+      </w:r>
+      <w:proofErr w:type="spellEnd"/>
+      <w:r>
+        <w:rPr>
+          <w:rFonts w:ascii="Times New Roman" w:hAnsi="Times New Roman" w:cs="Times New Roman"/>
+        </w:rPr>
+        <w:t xml:space="preserve"> </w:t>
+      </w:r>
+      <w:r>
+        <w:rPr>
+          <w:rFonts w:ascii="Times New Roman" w:hAnsi="Times New Roman" w:cs="Times New Roman"/>
+        </w:rPr>
+        <w:t>= 0</w:t>
+      </w:r>
+    </w:p>
+    <w:p>
+      <w:proofErr w:type="spellStart"/>
+      <w:r>
+        <w:rPr>
+          <w:rFonts w:ascii="Times New Roman" w:hAnsi="Times New Roman" w:cs="Times New Roman"/>
+        </w:rPr>
+        <w:t>Venta_Mayor</w:t>
+      </w:r>
+      <w:proofErr w:type="spellEnd"/>
+      <w:r>
+        <w:rPr>
+          <w:rFonts w:ascii="Times New Roman" w:hAnsi="Times New Roman" w:cs="Times New Roman"/>
+        </w:rPr>
+        <w:t xml:space="preserve"> </w:t>
+      </w:r>
+      <w:r>
+        <w:rPr>
+          <w:rFonts w:ascii="Times New Roman" w:hAnsi="Times New Roman" w:cs="Times New Roman"/>
+        </w:rPr>
+        <w:t>= 0</w:t>
+      </w:r>
+    </w:p>
+    <w:p>
+      <w:proofErr w:type="spellStart"/>
+      <w:r>
+        <w:rPr>
+          <w:rFonts w:ascii="Times New Roman" w:hAnsi="Times New Roman" w:cs="Times New Roman"/>
+        </w:rPr>
+        <w:t>Venta_Menor</w:t>
+      </w:r>
+      <w:proofErr w:type="spellEnd"/>
+      <w:r>
+        <w:rPr>
+          <w:rFonts w:ascii="Times New Roman" w:hAnsi="Times New Roman" w:cs="Times New Roman"/>
+        </w:rPr>
+        <w:t xml:space="preserve"> </w:t>
+      </w:r>
+      <w:r>
+        <w:rPr>
+          <w:rFonts w:ascii="Times New Roman" w:hAnsi="Times New Roman" w:cs="Times New Roman"/>
+        </w:rPr>
+        <w:t>= 0</w:t>
+      </w:r>
+    </w:p>
+    <w:p>
+      <w:proofErr w:type="spellStart"/>
+      <w:r>
+        <w:rPr>
+          <w:rFonts w:ascii="Times New Roman" w:hAnsi="Times New Roman" w:cs="Times New Roman"/>
+        </w:rPr>
+        <w:t>Total_Descuentos</w:t>
+      </w:r>
+      <w:proofErr w:type="spellEnd"/>
+      <w:r>
+        <w:rPr>
+          <w:rFonts w:ascii="Times New Roman" w:hAnsi="Times New Roman" w:cs="Times New Roman"/>
+        </w:rPr>
+        <w:t xml:space="preserve"> </w:t>
+      </w:r>
+      <w:r>
+        <w:rPr>
+          <w:rFonts w:ascii="Times New Roman" w:hAnsi="Times New Roman" w:cs="Times New Roman"/>
+        </w:rPr>
+        <w:t>= 0</w:t>
+      </w:r>
+    </w:p>
+    <w:p>
+      <w:pPr>
+        <w:rPr>
+          <w:rFonts w:ascii="Times New Roman" w:hAnsi="Times New Roman" w:cs="Times New Roman"/>
+        </w:rPr>
+      </w:pPr>
+      <w:proofErr w:type="spellStart"/>
+      <w:r>
+        <w:rPr>
+          <w:rFonts w:ascii="Times New Roman" w:hAnsi="Times New Roman" w:cs="Times New Roman"/>
+        </w:rPr>
+        <w:t>Contador_Ventas</w:t>
+      </w:r>
+      <w:proofErr w:type="spellEnd"/>
+      <w:r>
+        <w:rPr>
+          <w:rFonts w:ascii="Times New Roman" w:hAnsi="Times New Roman" w:cs="Times New Roman"/>
+        </w:rPr>
+        <w:t xml:space="preserve"> = 0</w:t>
+      </w:r>
+    </w:p>
+    <w:p>
+      <w:pPr>
+        <w:rPr>
+          <w:rFonts w:ascii="Times New Roman" w:hAnsi="Times New Roman" w:cs="Times New Roman"/>
+        </w:rPr>
+      </w:pPr>
+    </w:p>
+    <w:p>
+      <w:pPr>
+        <w:rPr>
+          <w:rFonts w:ascii="Times New Roman" w:hAnsi="Times New Roman" w:cs="Times New Roman"/>
+        </w:rPr>
+      </w:pPr>
+    </w:p>
+    <w:p>
+      <w:pPr>
+        <w:rPr>
+          <w:rFonts w:ascii="Times New Roman" w:hAnsi="Times New Roman" w:cs="Times New Roman"/>
+        </w:rPr>
+      </w:pPr>
+      <w:r>
+        <w:rPr>
+          <w:rFonts w:ascii="Times New Roman" w:hAnsi="Times New Roman" w:cs="Times New Roman"/>
+        </w:rPr>
+        <w:t>Repetir</w:t>
+      </w:r>
+    </w:p>
+    <w:p>
+      <w:pPr>
+        <w:rPr>
+          <w:rFonts w:ascii="Times New Roman" w:hAnsi="Times New Roman" w:cs="Times New Roman"/>
+        </w:rPr>
+      </w:pPr>
+      <w:r>
+        <w:rPr>
+          <w:rFonts w:ascii="Times New Roman" w:hAnsi="Times New Roman" w:cs="Times New Roman"/>
+        </w:rPr>
+        <w:t xml:space="preserve">  </w:t>
+      </w:r>
+      <w:proofErr w:type="gramStart"/>
+      <w:r>
+        <w:rPr>
+          <w:rFonts w:ascii="Times New Roman" w:hAnsi="Times New Roman" w:cs="Times New Roman"/>
+        </w:rPr>
+        <w:t xml:space="preserve">Mostrar "Buen </w:t>
+      </w:r>
+      <w:proofErr w:type="spellStart"/>
+      <w:r>
+        <w:rPr>
+          <w:rFonts w:ascii="Times New Roman" w:hAnsi="Times New Roman" w:cs="Times New Roman"/>
+        </w:rPr>
+        <w:t>dia</w:t>
+      </w:r>
+      <w:proofErr w:type="spellEnd"/>
+      <w:r>
+        <w:rPr>
+          <w:rFonts w:ascii="Times New Roman" w:hAnsi="Times New Roman" w:cs="Times New Roman"/>
+        </w:rPr>
+        <w:t>, Que desea hacer?</w:t>
+      </w:r>
+      <w:proofErr w:type="gramEnd"/>
+      <w:r>
+        <w:rPr>
+          <w:rFonts w:ascii="Times New Roman" w:hAnsi="Times New Roman" w:cs="Times New Roman"/>
+        </w:rPr>
+        <w:t xml:space="preserve">"           </w:t>
       </w:r>
     </w:p>
     <w:p>
@@ -805,7 +1112,21 @@
         <w:rPr>
           <w:rFonts w:ascii="Times New Roman" w:hAnsi="Times New Roman" w:cs="Times New Roman"/>
         </w:rPr>
-        <w:t xml:space="preserve">  Mostrar "2. Ver el resumen parcial del dia"</w:t>
+        <w:t xml:space="preserve">  Mostrar "2. Ver el resumen parcial del </w:t>
+      </w:r>
+      <w:proofErr w:type="spellStart"/>
+      <w:r>
+        <w:rPr>
+          <w:rFonts w:ascii="Times New Roman" w:hAnsi="Times New Roman" w:cs="Times New Roman"/>
+        </w:rPr>
+        <w:t>dia</w:t>
+      </w:r>
+      <w:proofErr w:type="spellEnd"/>
+      <w:r>
+        <w:rPr>
+          <w:rFonts w:ascii="Times New Roman" w:hAnsi="Times New Roman" w:cs="Times New Roman"/>
+        </w:rPr>
+        <w:t>"</w:t>
       </w:r>
     </w:p>
     <w:p>
@@ -909,7 +1230,6 @@
         <w:rPr>
           <w:rFonts w:ascii="Times New Roman" w:hAnsi="Times New Roman" w:cs="Times New Roman"/>
         </w:rPr>
-        <w:lastRenderedPageBreak/>
         <w:t xml:space="preserve">   Mostrar "Ingrese el precio del producto o 0 para terminar"</w:t>
       </w:r>
     </w:p>
@@ -994,7 +1314,35 @@
         <w:rPr>
           <w:rFonts w:ascii="Times New Roman" w:hAnsi="Times New Roman" w:cs="Times New Roman"/>
         </w:rPr>
-        <w:t xml:space="preserve">     Resumen_precio = Resumen_precio + precio    </w:t>
+        <w:t xml:space="preserve">     </w:t>
+      </w:r>
+      <w:proofErr w:type="spellStart"/>
+      <w:r>
+        <w:rPr>
+          <w:rFonts w:ascii="Times New Roman" w:hAnsi="Times New Roman" w:cs="Times New Roman"/>
+        </w:rPr>
+        <w:t>Resumen_precio</w:t>
+      </w:r>
+      <w:proofErr w:type="spellEnd"/>
+      <w:r>
+        <w:rPr>
+          <w:rFonts w:ascii="Times New Roman" w:hAnsi="Times New Roman" w:cs="Times New Roman"/>
+        </w:rPr>
+        <w:t xml:space="preserve"> = </w:t>
+      </w:r>
+      <w:proofErr w:type="spellStart"/>
+      <w:r>
+        <w:rPr>
+          <w:rFonts w:ascii="Times New Roman" w:hAnsi="Times New Roman" w:cs="Times New Roman"/>
+        </w:rPr>
+        <w:t>Resumen_precio</w:t>
+      </w:r>
+      <w:proofErr w:type="spellEnd"/>
+      <w:r>
+        <w:rPr>
+          <w:rFonts w:ascii="Times New Roman" w:hAnsi="Times New Roman" w:cs="Times New Roman"/>
+        </w:rPr>
+        <w:t xml:space="preserve"> + precio    </w:t>
       </w:r>
     </w:p>
     <w:p>
@@ -1094,12 +1442,14 @@
           <w:rFonts w:ascii="Times New Roman" w:hAnsi="Times New Roman" w:cs="Times New Roman"/>
         </w:rPr>
       </w:pPr>
+      <w:proofErr w:type="spellStart"/>
       <w:r>
         <w:rPr>
           <w:rFonts w:ascii="Times New Roman" w:hAnsi="Times New Roman" w:cs="Times New Roman"/>
         </w:rPr>
         <w:t>FinMientras</w:t>
       </w:r>
+      <w:proofErr w:type="spellEnd"/>
     </w:p>
     <w:p>
       <w:pPr>
@@ -1120,24 +1470,40 @@
           <w:rFonts w:ascii="Times New Roman" w:hAnsi="Times New Roman" w:cs="Times New Roman"/>
         </w:rPr>
       </w:pPr>
-      <w:r>
-        <w:rPr>
-          <w:rFonts w:ascii="Times New Roman" w:hAnsi="Times New Roman" w:cs="Times New Roman"/>
-        </w:rPr>
-        <w:t xml:space="preserve">FinSi </w:t>
-      </w:r>
-    </w:p>
-    <w:p>
-      <w:pPr>
-        <w:rPr>
-          <w:rFonts w:ascii="Times New Roman" w:hAnsi="Times New Roman" w:cs="Times New Roman"/>
-        </w:rPr>
-      </w:pPr>
-      <w:r>
-        <w:rPr>
-          <w:rFonts w:ascii="Times New Roman" w:hAnsi="Times New Roman" w:cs="Times New Roman"/>
-        </w:rPr>
-        <w:t xml:space="preserve">FinSi </w:t>
+      <w:proofErr w:type="spellStart"/>
+      <w:r>
+        <w:rPr>
+          <w:rFonts w:ascii="Times New Roman" w:hAnsi="Times New Roman" w:cs="Times New Roman"/>
+        </w:rPr>
+        <w:t>FinSi</w:t>
+      </w:r>
+      <w:proofErr w:type="spellEnd"/>
+      <w:r>
+        <w:rPr>
+          <w:rFonts w:ascii="Times New Roman" w:hAnsi="Times New Roman" w:cs="Times New Roman"/>
+        </w:rPr>
+        <w:t xml:space="preserve"> </w:t>
+      </w:r>
+    </w:p>
+    <w:p>
+      <w:pPr>
+        <w:rPr>
+          <w:rFonts w:ascii="Times New Roman" w:hAnsi="Times New Roman" w:cs="Times New Roman"/>
+        </w:rPr>
+      </w:pPr>
+      <w:proofErr w:type="spellStart"/>
+      <w:r>
+        <w:rPr>
+          <w:rFonts w:ascii="Times New Roman" w:hAnsi="Times New Roman" w:cs="Times New Roman"/>
+        </w:rPr>
+        <w:t>FinSi</w:t>
+      </w:r>
+      <w:proofErr w:type="spellEnd"/>
+      <w:r>
+        <w:rPr>
+          <w:rFonts w:ascii="Times New Roman" w:hAnsi="Times New Roman" w:cs="Times New Roman"/>
+        </w:rPr>
+        <w:t xml:space="preserve"> </w:t>
       </w:r>
     </w:p>
     <w:p>
@@ -1272,21 +1638,42 @@
         <w:rPr>
           <w:rFonts w:ascii="Times New Roman" w:hAnsi="Times New Roman" w:cs="Times New Roman"/>
         </w:rPr>
-        <w:t xml:space="preserve"> FinSi </w:t>
-      </w:r>
-    </w:p>
-    <w:p>
-      <w:pPr>
-        <w:rPr>
-          <w:rFonts w:ascii="Times New Roman" w:hAnsi="Times New Roman" w:cs="Times New Roman"/>
-        </w:rPr>
-      </w:pPr>
-      <w:r>
-        <w:rPr>
-          <w:rFonts w:ascii="Times New Roman" w:hAnsi="Times New Roman" w:cs="Times New Roman"/>
-        </w:rPr>
-        <w:lastRenderedPageBreak/>
-        <w:t xml:space="preserve">FinSi </w:t>
+        <w:t xml:space="preserve"> </w:t>
+      </w:r>
+      <w:proofErr w:type="spellStart"/>
+      <w:r>
+        <w:rPr>
+          <w:rFonts w:ascii="Times New Roman" w:hAnsi="Times New Roman" w:cs="Times New Roman"/>
+        </w:rPr>
+        <w:t>FinSi</w:t>
+      </w:r>
+      <w:proofErr w:type="spellEnd"/>
+      <w:r>
+        <w:rPr>
+          <w:rFonts w:ascii="Times New Roman" w:hAnsi="Times New Roman" w:cs="Times New Roman"/>
+        </w:rPr>
+        <w:t xml:space="preserve"> </w:t>
+      </w:r>
+    </w:p>
+    <w:p>
+      <w:pPr>
+        <w:rPr>
+          <w:rFonts w:ascii="Times New Roman" w:hAnsi="Times New Roman" w:cs="Times New Roman"/>
+        </w:rPr>
+      </w:pPr>
+      <w:proofErr w:type="spellStart"/>
+      <w:r>
+        <w:rPr>
+          <w:rFonts w:ascii="Times New Roman" w:hAnsi="Times New Roman" w:cs="Times New Roman"/>
+        </w:rPr>
+        <w:t>FinSi</w:t>
+      </w:r>
+      <w:proofErr w:type="spellEnd"/>
+      <w:r>
+        <w:rPr>
+          <w:rFonts w:ascii="Times New Roman" w:hAnsi="Times New Roman" w:cs="Times New Roman"/>
+        </w:rPr>
+        <w:t xml:space="preserve"> </w:t>
       </w:r>
     </w:p>
     <w:p>
@@ -1510,12 +1897,14 @@
           <w:rFonts w:ascii="Times New Roman" w:hAnsi="Times New Roman" w:cs="Times New Roman"/>
         </w:rPr>
       </w:pPr>
+      <w:proofErr w:type="spellStart"/>
       <w:r>
         <w:rPr>
           <w:rFonts w:ascii="Times New Roman" w:hAnsi="Times New Roman" w:cs="Times New Roman"/>
         </w:rPr>
         <w:t>Finsi</w:t>
       </w:r>
+      <w:proofErr w:type="spellEnd"/>
     </w:p>
     <w:p>
       <w:pPr>
@@ -1623,7 +2012,14 @@
         <w:rPr>
           <w:rFonts w:ascii="Times New Roman" w:hAnsi="Times New Roman" w:cs="Times New Roman"/>
         </w:rPr>
-        <w:t>Mostrar "Subtotal con descuento: "</w:t>
+        <w:t xml:space="preserve">Mostrar "Subtotal con descuento: </w:t>
+      </w:r>
+      <w:proofErr w:type="gramStart"/>
+      <w:r>
+        <w:rPr>
+          <w:rFonts w:ascii="Times New Roman" w:hAnsi="Times New Roman" w:cs="Times New Roman"/>
+        </w:rPr>
+        <w:t>"</w:t>
       </w:r>
       <w:r>
         <w:rPr>
@@ -1635,20 +2031,34 @@
         <w:rPr>
           <w:rFonts w:ascii="Times New Roman" w:hAnsi="Times New Roman" w:cs="Times New Roman"/>
         </w:rPr>
-        <w:t>, Subtotal</w:t>
-      </w:r>
-    </w:p>
-    <w:p>
-      <w:pPr>
-        <w:rPr>
-          <w:rFonts w:ascii="Times New Roman" w:hAnsi="Times New Roman" w:cs="Times New Roman"/>
-        </w:rPr>
-      </w:pPr>
-      <w:r>
-        <w:rPr>
-          <w:rFonts w:ascii="Times New Roman" w:hAnsi="Times New Roman" w:cs="Times New Roman"/>
-        </w:rPr>
-        <w:t>Mostrar "IVA (12%): "</w:t>
+        <w:t>,</w:t>
+      </w:r>
+      <w:proofErr w:type="gramEnd"/>
+      <w:r>
+        <w:rPr>
+          <w:rFonts w:ascii="Times New Roman" w:hAnsi="Times New Roman" w:cs="Times New Roman"/>
+        </w:rPr>
+        <w:t xml:space="preserve"> Subtotal</w:t>
+      </w:r>
+    </w:p>
+    <w:p>
+      <w:pPr>
+        <w:rPr>
+          <w:rFonts w:ascii="Times New Roman" w:hAnsi="Times New Roman" w:cs="Times New Roman"/>
+        </w:rPr>
+      </w:pPr>
+      <w:r>
+        <w:rPr>
+          <w:rFonts w:ascii="Times New Roman" w:hAnsi="Times New Roman" w:cs="Times New Roman"/>
+        </w:rPr>
+        <w:t xml:space="preserve">Mostrar "IVA (12%): </w:t>
+      </w:r>
+      <w:proofErr w:type="gramStart"/>
+      <w:r>
+        <w:rPr>
+          <w:rFonts w:ascii="Times New Roman" w:hAnsi="Times New Roman" w:cs="Times New Roman"/>
+        </w:rPr>
+        <w:t>"</w:t>
       </w:r>
       <w:r>
         <w:rPr>
@@ -1662,6 +2072,7 @@
         </w:rPr>
         <w:t>,</w:t>
       </w:r>
+      <w:proofErr w:type="gramEnd"/>
       <w:r>
         <w:rPr>
           <w:rFonts w:ascii="Times New Roman" w:hAnsi="Times New Roman" w:cs="Times New Roman"/>
@@ -1685,7 +2096,14 @@
         <w:rPr>
           <w:rFonts w:ascii="Times New Roman" w:hAnsi="Times New Roman" w:cs="Times New Roman"/>
         </w:rPr>
-        <w:t>Mostrar "Total: "</w:t>
+        <w:t xml:space="preserve">Mostrar "Total: </w:t>
+      </w:r>
+      <w:proofErr w:type="gramStart"/>
+      <w:r>
+        <w:rPr>
+          <w:rFonts w:ascii="Times New Roman" w:hAnsi="Times New Roman" w:cs="Times New Roman"/>
+        </w:rPr>
+        <w:t>"</w:t>
       </w:r>
       <w:r>
         <w:rPr>
@@ -1697,20 +2115,34 @@
         <w:rPr>
           <w:rFonts w:ascii="Times New Roman" w:hAnsi="Times New Roman" w:cs="Times New Roman"/>
         </w:rPr>
-        <w:t>, Total</w:t>
-      </w:r>
-    </w:p>
-    <w:p>
-      <w:pPr>
-        <w:rPr>
-          <w:rFonts w:ascii="Times New Roman" w:hAnsi="Times New Roman" w:cs="Times New Roman"/>
-        </w:rPr>
-      </w:pPr>
-      <w:r>
-        <w:rPr>
-          <w:rFonts w:ascii="Times New Roman" w:hAnsi="Times New Roman" w:cs="Times New Roman"/>
-        </w:rPr>
-        <w:t>Mostrar "Pago: "</w:t>
+        <w:t>,</w:t>
+      </w:r>
+      <w:proofErr w:type="gramEnd"/>
+      <w:r>
+        <w:rPr>
+          <w:rFonts w:ascii="Times New Roman" w:hAnsi="Times New Roman" w:cs="Times New Roman"/>
+        </w:rPr>
+        <w:t xml:space="preserve"> Total</w:t>
+      </w:r>
+    </w:p>
+    <w:p>
+      <w:pPr>
+        <w:rPr>
+          <w:rFonts w:ascii="Times New Roman" w:hAnsi="Times New Roman" w:cs="Times New Roman"/>
+        </w:rPr>
+      </w:pPr>
+      <w:r>
+        <w:rPr>
+          <w:rFonts w:ascii="Times New Roman" w:hAnsi="Times New Roman" w:cs="Times New Roman"/>
+        </w:rPr>
+        <w:t xml:space="preserve">Mostrar "Pago: </w:t>
+      </w:r>
+      <w:proofErr w:type="gramStart"/>
+      <w:r>
+        <w:rPr>
+          <w:rFonts w:ascii="Times New Roman" w:hAnsi="Times New Roman" w:cs="Times New Roman"/>
+        </w:rPr>
+        <w:t>"</w:t>
       </w:r>
       <w:r>
         <w:rPr>
@@ -1722,7 +2154,14 @@
         <w:rPr>
           <w:rFonts w:ascii="Times New Roman" w:hAnsi="Times New Roman" w:cs="Times New Roman"/>
         </w:rPr>
-        <w:t>, Pago</w:t>
+        <w:t>,</w:t>
+      </w:r>
+      <w:proofErr w:type="gramEnd"/>
+      <w:r>
+        <w:rPr>
+          <w:rFonts w:ascii="Times New Roman" w:hAnsi="Times New Roman" w:cs="Times New Roman"/>
+        </w:rPr>
+        <w:t xml:space="preserve"> Pago</w:t>
       </w:r>
     </w:p>
     <w:p>
@@ -1755,6 +2194,411 @@
       <w:pPr>
         <w:rPr>
           <w:rFonts w:ascii="Times New Roman" w:hAnsi="Times New Roman" w:cs="Times New Roman"/>
+          <w:highlight w:val="yellow"/>
+        </w:rPr>
+      </w:pPr>
+      <w:proofErr w:type="spellStart"/>
+      <w:r>
+        <w:rPr>
+          <w:rFonts w:ascii="Times New Roman" w:hAnsi="Times New Roman" w:cs="Times New Roman"/>
+          <w:highlight w:val="yellow"/>
+        </w:rPr>
+        <w:t>Contador_ventas</w:t>
+      </w:r>
+      <w:proofErr w:type="spellEnd"/>
+      <w:r>
+        <w:rPr>
+          <w:rFonts w:ascii="Times New Roman" w:hAnsi="Times New Roman" w:cs="Times New Roman"/>
+          <w:highlight w:val="yellow"/>
+        </w:rPr>
+        <w:t xml:space="preserve"> = </w:t>
+      </w:r>
+      <w:proofErr w:type="spellStart"/>
+      <w:r>
+        <w:rPr>
+          <w:rFonts w:ascii="Times New Roman" w:hAnsi="Times New Roman" w:cs="Times New Roman"/>
+          <w:highlight w:val="yellow"/>
+        </w:rPr>
+        <w:t>Contador_ventas</w:t>
+      </w:r>
+      <w:proofErr w:type="spellEnd"/>
+      <w:r>
+        <w:rPr>
+          <w:rFonts w:ascii="Times New Roman" w:hAnsi="Times New Roman" w:cs="Times New Roman"/>
+          <w:highlight w:val="yellow"/>
+        </w:rPr>
+        <w:t xml:space="preserve"> + 1</w:t>
+      </w:r>
+    </w:p>
+    <w:p>
+      <w:pPr>
+        <w:rPr>
+          <w:rFonts w:ascii="Times New Roman" w:hAnsi="Times New Roman" w:cs="Times New Roman"/>
+          <w:highlight w:val="yellow"/>
+        </w:rPr>
+      </w:pPr>
+      <w:proofErr w:type="spellStart"/>
+      <w:r>
+        <w:rPr>
+          <w:rFonts w:ascii="Times New Roman" w:hAnsi="Times New Roman" w:cs="Times New Roman"/>
+          <w:highlight w:val="yellow"/>
+        </w:rPr>
+        <w:t>Total_vendido</w:t>
+      </w:r>
+      <w:proofErr w:type="spellEnd"/>
+      <w:r>
+        <w:rPr>
+          <w:rFonts w:ascii="Times New Roman" w:hAnsi="Times New Roman" w:cs="Times New Roman"/>
+          <w:highlight w:val="yellow"/>
+        </w:rPr>
+        <w:t xml:space="preserve"> = </w:t>
+      </w:r>
+      <w:proofErr w:type="spellStart"/>
+      <w:r>
+        <w:rPr>
+          <w:rFonts w:ascii="Times New Roman" w:hAnsi="Times New Roman" w:cs="Times New Roman"/>
+          <w:highlight w:val="yellow"/>
+        </w:rPr>
+        <w:t>Total_vendido</w:t>
+      </w:r>
+      <w:proofErr w:type="spellEnd"/>
+      <w:r>
+        <w:rPr>
+          <w:rFonts w:ascii="Times New Roman" w:hAnsi="Times New Roman" w:cs="Times New Roman"/>
+          <w:highlight w:val="yellow"/>
+        </w:rPr>
+        <w:t xml:space="preserve"> + </w:t>
+      </w:r>
+      <w:r>
+        <w:rPr>
+          <w:rFonts w:ascii="Times New Roman" w:hAnsi="Times New Roman" w:cs="Times New Roman"/>
+          <w:highlight w:val="yellow"/>
+        </w:rPr>
+        <w:t>Total</w:t>
+      </w:r>
+    </w:p>
+    <w:p>
+      <w:pPr>
+        <w:rPr>
+          <w:rFonts w:ascii="Times New Roman" w:hAnsi="Times New Roman" w:cs="Times New Roman"/>
+          <w:highlight w:val="yellow"/>
+        </w:rPr>
+      </w:pPr>
+      <w:proofErr w:type="spellStart"/>
+      <w:r>
+        <w:rPr>
+          <w:rFonts w:ascii="Times New Roman" w:hAnsi="Times New Roman" w:cs="Times New Roman"/>
+          <w:highlight w:val="yellow"/>
+        </w:rPr>
+        <w:t>Total_descuentos</w:t>
+      </w:r>
+      <w:proofErr w:type="spellEnd"/>
+      <w:r>
+        <w:rPr>
+          <w:rFonts w:ascii="Times New Roman" w:hAnsi="Times New Roman" w:cs="Times New Roman"/>
+          <w:highlight w:val="yellow"/>
+        </w:rPr>
+        <w:t xml:space="preserve"> = </w:t>
+      </w:r>
+      <w:proofErr w:type="spellStart"/>
+      <w:r>
+        <w:rPr>
+          <w:rFonts w:ascii="Times New Roman" w:hAnsi="Times New Roman" w:cs="Times New Roman"/>
+          <w:highlight w:val="yellow"/>
+        </w:rPr>
+        <w:t>Total_descuentos</w:t>
+      </w:r>
+      <w:proofErr w:type="spellEnd"/>
+      <w:r>
+        <w:rPr>
+          <w:rFonts w:ascii="Times New Roman" w:hAnsi="Times New Roman" w:cs="Times New Roman"/>
+          <w:highlight w:val="yellow"/>
+        </w:rPr>
+        <w:t xml:space="preserve"> + Descuentos</w:t>
+      </w:r>
+    </w:p>
+    <w:p>
+      <w:pPr>
+        <w:rPr>
+          <w:rFonts w:ascii="Times New Roman" w:hAnsi="Times New Roman" w:cs="Times New Roman"/>
+          <w:highlight w:val="yellow"/>
+        </w:rPr>
+      </w:pPr>
+      <w:r>
+        <w:rPr>
+          <w:rFonts w:ascii="Times New Roman" w:hAnsi="Times New Roman" w:cs="Times New Roman"/>
+          <w:highlight w:val="yellow"/>
+        </w:rPr>
+        <w:t xml:space="preserve">Si </w:t>
+      </w:r>
+      <w:proofErr w:type="spellStart"/>
+      <w:r>
+        <w:rPr>
+          <w:rFonts w:ascii="Times New Roman" w:hAnsi="Times New Roman" w:cs="Times New Roman"/>
+          <w:highlight w:val="yellow"/>
+        </w:rPr>
+        <w:t>Contador_ventas</w:t>
+      </w:r>
+      <w:proofErr w:type="spellEnd"/>
+      <w:r>
+        <w:rPr>
+          <w:rFonts w:ascii="Times New Roman" w:hAnsi="Times New Roman" w:cs="Times New Roman"/>
+          <w:highlight w:val="yellow"/>
+        </w:rPr>
+        <w:t xml:space="preserve"> = 1 Entonces</w:t>
+      </w:r>
+    </w:p>
+    <w:p>
+      <w:pPr>
+        <w:rPr>
+          <w:rFonts w:ascii="Times New Roman" w:hAnsi="Times New Roman" w:cs="Times New Roman"/>
+          <w:highlight w:val="yellow"/>
+        </w:rPr>
+      </w:pPr>
+      <w:proofErr w:type="spellStart"/>
+      <w:r>
+        <w:rPr>
+          <w:rFonts w:ascii="Times New Roman" w:hAnsi="Times New Roman" w:cs="Times New Roman"/>
+          <w:highlight w:val="yellow"/>
+        </w:rPr>
+        <w:t>Venta_Menor</w:t>
+      </w:r>
+      <w:proofErr w:type="spellEnd"/>
+      <w:r>
+        <w:rPr>
+          <w:rFonts w:ascii="Times New Roman" w:hAnsi="Times New Roman" w:cs="Times New Roman"/>
+          <w:highlight w:val="yellow"/>
+        </w:rPr>
+        <w:t xml:space="preserve"> = </w:t>
+      </w:r>
+      <w:r>
+        <w:rPr>
+          <w:rFonts w:ascii="Times New Roman" w:hAnsi="Times New Roman" w:cs="Times New Roman"/>
+          <w:highlight w:val="yellow"/>
+        </w:rPr>
+        <w:t>Total</w:t>
+      </w:r>
+    </w:p>
+    <w:p>
+      <w:pPr>
+        <w:rPr>
+          <w:rFonts w:ascii="Times New Roman" w:hAnsi="Times New Roman" w:cs="Times New Roman"/>
+          <w:highlight w:val="yellow"/>
+        </w:rPr>
+      </w:pPr>
+      <w:proofErr w:type="spellStart"/>
+      <w:r>
+        <w:rPr>
+          <w:rFonts w:ascii="Times New Roman" w:hAnsi="Times New Roman" w:cs="Times New Roman"/>
+          <w:highlight w:val="yellow"/>
+        </w:rPr>
+        <w:t>Venta_</w:t>
+      </w:r>
+      <w:r>
+        <w:rPr>
+          <w:rFonts w:ascii="Times New Roman" w:hAnsi="Times New Roman" w:cs="Times New Roman"/>
+          <w:highlight w:val="yellow"/>
+        </w:rPr>
+        <w:t>Mayor</w:t>
+      </w:r>
+      <w:proofErr w:type="spellEnd"/>
+      <w:r>
+        <w:rPr>
+          <w:rFonts w:ascii="Times New Roman" w:hAnsi="Times New Roman" w:cs="Times New Roman"/>
+          <w:highlight w:val="yellow"/>
+        </w:rPr>
+        <w:t xml:space="preserve"> = Total</w:t>
+      </w:r>
+    </w:p>
+    <w:p>
+      <w:pPr>
+        <w:rPr>
+          <w:rFonts w:ascii="Times New Roman" w:hAnsi="Times New Roman" w:cs="Times New Roman"/>
+          <w:highlight w:val="yellow"/>
+        </w:rPr>
+      </w:pPr>
+      <w:r>
+        <w:rPr>
+          <w:rFonts w:ascii="Times New Roman" w:hAnsi="Times New Roman" w:cs="Times New Roman"/>
+          <w:highlight w:val="yellow"/>
+        </w:rPr>
+        <w:t>Sino</w:t>
+      </w:r>
+    </w:p>
+    <w:p>
+      <w:pPr>
+        <w:rPr>
+          <w:rFonts w:ascii="Times New Roman" w:hAnsi="Times New Roman" w:cs="Times New Roman"/>
+          <w:highlight w:val="yellow"/>
+        </w:rPr>
+      </w:pPr>
+      <w:r>
+        <w:rPr>
+          <w:rFonts w:ascii="Times New Roman" w:hAnsi="Times New Roman" w:cs="Times New Roman"/>
+          <w:highlight w:val="yellow"/>
+        </w:rPr>
+        <w:t>Si</w:t>
+      </w:r>
+      <w:r>
+        <w:rPr>
+          <w:rFonts w:ascii="Times New Roman" w:hAnsi="Times New Roman" w:cs="Times New Roman"/>
+          <w:highlight w:val="yellow"/>
+        </w:rPr>
+        <w:t xml:space="preserve"> </w:t>
+      </w:r>
+      <w:proofErr w:type="spellStart"/>
+      <w:r>
+        <w:rPr>
+          <w:rFonts w:ascii="Times New Roman" w:hAnsi="Times New Roman" w:cs="Times New Roman"/>
+          <w:highlight w:val="yellow"/>
+        </w:rPr>
+        <w:t>Venta_Mayor</w:t>
+      </w:r>
+      <w:proofErr w:type="spellEnd"/>
+      <w:r>
+        <w:rPr>
+          <w:rFonts w:ascii="Times New Roman" w:hAnsi="Times New Roman" w:cs="Times New Roman"/>
+          <w:highlight w:val="yellow"/>
+        </w:rPr>
+        <w:t xml:space="preserve"> &lt; Total Entonces</w:t>
+      </w:r>
+    </w:p>
+    <w:p>
+      <w:pPr>
+        <w:rPr>
+          <w:rFonts w:ascii="Times New Roman" w:hAnsi="Times New Roman" w:cs="Times New Roman"/>
+          <w:highlight w:val="yellow"/>
+        </w:rPr>
+      </w:pPr>
+      <w:proofErr w:type="spellStart"/>
+      <w:r>
+        <w:rPr>
+          <w:rFonts w:ascii="Times New Roman" w:hAnsi="Times New Roman" w:cs="Times New Roman"/>
+          <w:highlight w:val="yellow"/>
+        </w:rPr>
+        <w:t>Venta_Mayor</w:t>
+      </w:r>
+      <w:proofErr w:type="spellEnd"/>
+      <w:r>
+        <w:rPr>
+          <w:rFonts w:ascii="Times New Roman" w:hAnsi="Times New Roman" w:cs="Times New Roman"/>
+          <w:highlight w:val="yellow"/>
+        </w:rPr>
+        <w:t xml:space="preserve"> = Total</w:t>
+      </w:r>
+    </w:p>
+    <w:p>
+      <w:pPr>
+        <w:rPr>
+          <w:rFonts w:ascii="Times New Roman" w:hAnsi="Times New Roman" w:cs="Times New Roman"/>
+          <w:highlight w:val="yellow"/>
+        </w:rPr>
+      </w:pPr>
+      <w:proofErr w:type="spellStart"/>
+      <w:r>
+        <w:rPr>
+          <w:rFonts w:ascii="Times New Roman" w:hAnsi="Times New Roman" w:cs="Times New Roman"/>
+          <w:highlight w:val="yellow"/>
+        </w:rPr>
+        <w:t>FinSi</w:t>
+      </w:r>
+      <w:proofErr w:type="spellEnd"/>
+    </w:p>
+    <w:p>
+      <w:pPr>
+        <w:rPr>
+          <w:rFonts w:ascii="Times New Roman" w:hAnsi="Times New Roman" w:cs="Times New Roman"/>
+          <w:highlight w:val="yellow"/>
+        </w:rPr>
+      </w:pPr>
+      <w:r>
+        <w:rPr>
+          <w:rFonts w:ascii="Times New Roman" w:hAnsi="Times New Roman" w:cs="Times New Roman"/>
+          <w:highlight w:val="yellow"/>
+        </w:rPr>
+        <w:t xml:space="preserve">Si </w:t>
+      </w:r>
+      <w:proofErr w:type="spellStart"/>
+      <w:r>
+        <w:rPr>
+          <w:rFonts w:ascii="Times New Roman" w:hAnsi="Times New Roman" w:cs="Times New Roman"/>
+          <w:highlight w:val="yellow"/>
+        </w:rPr>
+        <w:t>Venta_Menor</w:t>
+      </w:r>
+      <w:proofErr w:type="spellEnd"/>
+      <w:r>
+        <w:rPr>
+          <w:rFonts w:ascii="Times New Roman" w:hAnsi="Times New Roman" w:cs="Times New Roman"/>
+          <w:highlight w:val="yellow"/>
+        </w:rPr>
+        <w:t xml:space="preserve"> </w:t>
+      </w:r>
+      <w:r>
+        <w:rPr>
+          <w:rFonts w:ascii="Times New Roman" w:hAnsi="Times New Roman" w:cs="Times New Roman"/>
+          <w:highlight w:val="yellow"/>
+        </w:rPr>
+        <w:t>&gt; Total Entonces</w:t>
+      </w:r>
+    </w:p>
+    <w:p>
+      <w:pPr>
+        <w:rPr>
+          <w:rFonts w:ascii="Times New Roman" w:hAnsi="Times New Roman" w:cs="Times New Roman"/>
+        </w:rPr>
+      </w:pPr>
+      <w:proofErr w:type="spellStart"/>
+      <w:r>
+        <w:rPr>
+          <w:rFonts w:ascii="Times New Roman" w:hAnsi="Times New Roman" w:cs="Times New Roman"/>
+          <w:highlight w:val="yellow"/>
+        </w:rPr>
+        <w:t>Venta_Menor</w:t>
+      </w:r>
+      <w:proofErr w:type="spellEnd"/>
+      <w:r>
+        <w:rPr>
+          <w:rFonts w:ascii="Times New Roman" w:hAnsi="Times New Roman" w:cs="Times New Roman"/>
+          <w:highlight w:val="yellow"/>
+        </w:rPr>
+        <w:t xml:space="preserve"> = Total</w:t>
+      </w:r>
+    </w:p>
+    <w:p>
+      <w:pPr>
+        <w:rPr>
+          <w:rFonts w:ascii="Times New Roman" w:hAnsi="Times New Roman" w:cs="Times New Roman"/>
+        </w:rPr>
+      </w:pPr>
+      <w:proofErr w:type="spellStart"/>
+      <w:r>
+        <w:rPr>
+          <w:rFonts w:ascii="Times New Roman" w:hAnsi="Times New Roman" w:cs="Times New Roman"/>
+        </w:rPr>
+        <w:t>Finsi</w:t>
+      </w:r>
+      <w:proofErr w:type="spellEnd"/>
+    </w:p>
+    <w:p>
+      <w:pPr>
+        <w:rPr>
+          <w:rFonts w:ascii="Times New Roman" w:hAnsi="Times New Roman" w:cs="Times New Roman"/>
+        </w:rPr>
+      </w:pPr>
+      <w:proofErr w:type="spellStart"/>
+      <w:r>
+        <w:rPr>
+          <w:rFonts w:ascii="Times New Roman" w:hAnsi="Times New Roman" w:cs="Times New Roman"/>
+        </w:rPr>
+        <w:t>Finsi</w:t>
+      </w:r>
+      <w:proofErr w:type="spellEnd"/>
+    </w:p>
+    <w:p>
+      <w:pPr>
+        <w:rPr>
+          <w:rFonts w:ascii="Times New Roman" w:hAnsi="Times New Roman" w:cs="Times New Roman"/>
         </w:rPr>
       </w:pPr>
       <w:r>
@@ -1801,12 +2645,14 @@
           <w:rFonts w:ascii="Times New Roman" w:hAnsi="Times New Roman" w:cs="Times New Roman"/>
         </w:rPr>
       </w:pPr>
+      <w:proofErr w:type="spellStart"/>
       <w:r>
         <w:rPr>
           <w:rFonts w:ascii="Times New Roman" w:hAnsi="Times New Roman" w:cs="Times New Roman"/>
         </w:rPr>
         <w:t>Finsi</w:t>
       </w:r>
+      <w:proofErr w:type="spellEnd"/>
     </w:p>
     <w:p>
       <w:pPr>
@@ -1838,53 +2684,481 @@
       <w:pPr>
         <w:rPr>
           <w:rFonts w:ascii="Times New Roman" w:hAnsi="Times New Roman" w:cs="Times New Roman"/>
-        </w:rPr>
-      </w:pPr>
-      <w:r>
-        <w:rPr>
-          <w:rFonts w:ascii="Times New Roman" w:hAnsi="Times New Roman" w:cs="Times New Roman"/>
-        </w:rPr>
-        <w:t xml:space="preserve">  Mostrar "Resumen parcial de ventas"            </w:t>
-      </w:r>
-    </w:p>
-    <w:p>
-      <w:pPr>
-        <w:rPr>
-          <w:rFonts w:ascii="Times New Roman" w:hAnsi="Times New Roman" w:cs="Times New Roman"/>
-        </w:rPr>
-      </w:pPr>
-      <w:r>
-        <w:rPr>
-          <w:rFonts w:ascii="Times New Roman" w:hAnsi="Times New Roman" w:cs="Times New Roman"/>
-        </w:rPr>
-        <w:t xml:space="preserve">  Mostrar "Precio del producto: ", Resumen_precio   </w:t>
-      </w:r>
-    </w:p>
-    <w:p>
-      <w:pPr>
-        <w:rPr>
-          <w:rFonts w:ascii="Times New Roman" w:hAnsi="Times New Roman" w:cs="Times New Roman"/>
-        </w:rPr>
-      </w:pPr>
-      <w:r>
-        <w:rPr>
-          <w:rFonts w:ascii="Times New Roman" w:hAnsi="Times New Roman" w:cs="Times New Roman"/>
-        </w:rPr>
-        <w:t xml:space="preserve">  Mostrar "Cantidad del producto: ", Cantidad       </w:t>
-      </w:r>
-    </w:p>
-    <w:p>
-      <w:pPr>
-        <w:rPr>
-          <w:rFonts w:ascii="Times New Roman" w:hAnsi="Times New Roman" w:cs="Times New Roman"/>
-        </w:rPr>
-      </w:pPr>
-      <w:r>
-        <w:rPr>
-          <w:rFonts w:ascii="Times New Roman" w:hAnsi="Times New Roman" w:cs="Times New Roman"/>
-        </w:rPr>
-        <w:t xml:space="preserve">  Mostrar "Subtotal vendido: ", Subtotal            </w:t>
-      </w:r>
+          <w:highlight w:val="yellow"/>
+        </w:rPr>
+      </w:pPr>
+      <w:r>
+        <w:rPr>
+          <w:rFonts w:ascii="Times New Roman" w:hAnsi="Times New Roman" w:cs="Times New Roman"/>
+          <w:highlight w:val="yellow"/>
+        </w:rPr>
+        <w:t>Si</w:t>
+      </w:r>
+      <w:r>
+        <w:rPr>
+          <w:rFonts w:ascii="Times New Roman" w:hAnsi="Times New Roman" w:cs="Times New Roman"/>
+          <w:highlight w:val="yellow"/>
+        </w:rPr>
+        <w:t xml:space="preserve"> </w:t>
+      </w:r>
+      <w:proofErr w:type="spellStart"/>
+      <w:r>
+        <w:rPr>
+          <w:rFonts w:ascii="Times New Roman" w:hAnsi="Times New Roman" w:cs="Times New Roman"/>
+          <w:highlight w:val="yellow"/>
+        </w:rPr>
+        <w:t>Contador_ventas</w:t>
+      </w:r>
+      <w:proofErr w:type="spellEnd"/>
+      <w:r>
+        <w:rPr>
+          <w:rFonts w:ascii="Times New Roman" w:hAnsi="Times New Roman" w:cs="Times New Roman"/>
+          <w:highlight w:val="yellow"/>
+        </w:rPr>
+        <w:t xml:space="preserve"> &gt;0 Entonces </w:t>
+      </w:r>
+    </w:p>
+    <w:p>
+      <w:pPr>
+        <w:rPr>
+          <w:rFonts w:ascii="Times New Roman" w:hAnsi="Times New Roman" w:cs="Times New Roman"/>
+          <w:highlight w:val="yellow"/>
+        </w:rPr>
+      </w:pPr>
+      <w:proofErr w:type="spellStart"/>
+      <w:r>
+        <w:rPr>
+          <w:rFonts w:ascii="Times New Roman" w:hAnsi="Times New Roman" w:cs="Times New Roman"/>
+          <w:highlight w:val="yellow"/>
+        </w:rPr>
+        <w:t>Promediov</w:t>
+      </w:r>
+      <w:proofErr w:type="spellEnd"/>
+      <w:r>
+        <w:rPr>
+          <w:rFonts w:ascii="Times New Roman" w:hAnsi="Times New Roman" w:cs="Times New Roman"/>
+          <w:highlight w:val="yellow"/>
+        </w:rPr>
+        <w:t xml:space="preserve"> = </w:t>
+      </w:r>
+      <w:proofErr w:type="spellStart"/>
+      <w:r>
+        <w:rPr>
+          <w:rFonts w:ascii="Times New Roman" w:hAnsi="Times New Roman" w:cs="Times New Roman"/>
+          <w:highlight w:val="yellow"/>
+        </w:rPr>
+        <w:t>Total_Vendido</w:t>
+      </w:r>
+      <w:proofErr w:type="spellEnd"/>
+      <w:r>
+        <w:rPr>
+          <w:rFonts w:ascii="Times New Roman" w:hAnsi="Times New Roman" w:cs="Times New Roman"/>
+          <w:highlight w:val="yellow"/>
+        </w:rPr>
+        <w:t xml:space="preserve"> / </w:t>
+      </w:r>
+      <w:proofErr w:type="spellStart"/>
+      <w:r>
+        <w:rPr>
+          <w:rFonts w:ascii="Times New Roman" w:hAnsi="Times New Roman" w:cs="Times New Roman"/>
+          <w:highlight w:val="yellow"/>
+        </w:rPr>
+        <w:t>Contador_Ventas</w:t>
+      </w:r>
+      <w:proofErr w:type="spellEnd"/>
+    </w:p>
+    <w:p>
+      <w:pPr>
+        <w:rPr>
+          <w:rFonts w:ascii="Times New Roman" w:hAnsi="Times New Roman" w:cs="Times New Roman"/>
+          <w:highlight w:val="yellow"/>
+        </w:rPr>
+      </w:pPr>
+      <w:r>
+        <w:rPr>
+          <w:rFonts w:ascii="Times New Roman" w:hAnsi="Times New Roman" w:cs="Times New Roman"/>
+          <w:highlight w:val="yellow"/>
+        </w:rPr>
+        <w:t xml:space="preserve">Mostrar </w:t>
+      </w:r>
+      <w:r>
+        <w:rPr>
+          <w:rFonts w:ascii="Times New Roman" w:hAnsi="Times New Roman" w:cs="Times New Roman"/>
+          <w:highlight w:val="yellow"/>
+        </w:rPr>
+        <w:t>"</w:t>
+      </w:r>
+      <w:r>
+        <w:rPr>
+          <w:rFonts w:ascii="Times New Roman" w:hAnsi="Times New Roman" w:cs="Times New Roman"/>
+          <w:highlight w:val="yellow"/>
+        </w:rPr>
+        <w:t xml:space="preserve">Ventas hechas en el </w:t>
+      </w:r>
+      <w:proofErr w:type="spellStart"/>
+      <w:r>
+        <w:rPr>
+          <w:rFonts w:ascii="Times New Roman" w:hAnsi="Times New Roman" w:cs="Times New Roman"/>
+          <w:highlight w:val="yellow"/>
+        </w:rPr>
+        <w:t>dia</w:t>
+      </w:r>
+      <w:proofErr w:type="spellEnd"/>
+      <w:r>
+        <w:rPr>
+          <w:rFonts w:ascii="Times New Roman" w:hAnsi="Times New Roman" w:cs="Times New Roman"/>
+          <w:highlight w:val="yellow"/>
+        </w:rPr>
+        <w:t xml:space="preserve">: </w:t>
+      </w:r>
+      <w:r>
+        <w:rPr>
+          <w:rFonts w:ascii="Times New Roman" w:hAnsi="Times New Roman" w:cs="Times New Roman"/>
+          <w:highlight w:val="yellow"/>
+        </w:rPr>
+        <w:t>"</w:t>
+      </w:r>
+      <w:r>
+        <w:rPr>
+          <w:rFonts w:ascii="Times New Roman" w:hAnsi="Times New Roman" w:cs="Times New Roman"/>
+          <w:highlight w:val="yellow"/>
+        </w:rPr>
+        <w:t xml:space="preserve"> </w:t>
+      </w:r>
+      <w:proofErr w:type="spellStart"/>
+      <w:r>
+        <w:rPr>
+          <w:rFonts w:ascii="Times New Roman" w:hAnsi="Times New Roman" w:cs="Times New Roman"/>
+          <w:highlight w:val="yellow"/>
+        </w:rPr>
+        <w:t>Contador_Ventas</w:t>
+      </w:r>
+      <w:proofErr w:type="spellEnd"/>
+    </w:p>
+    <w:p>
+      <w:pPr>
+        <w:rPr>
+          <w:rFonts w:ascii="Times New Roman" w:hAnsi="Times New Roman" w:cs="Times New Roman"/>
+          <w:highlight w:val="yellow"/>
+        </w:rPr>
+      </w:pPr>
+      <w:r>
+        <w:rPr>
+          <w:rFonts w:ascii="Times New Roman" w:hAnsi="Times New Roman" w:cs="Times New Roman"/>
+          <w:highlight w:val="yellow"/>
+        </w:rPr>
+        <w:t>Mostrar "</w:t>
+      </w:r>
+      <w:r>
+        <w:rPr>
+          <w:rFonts w:ascii="Times New Roman" w:hAnsi="Times New Roman" w:cs="Times New Roman"/>
+          <w:highlight w:val="yellow"/>
+        </w:rPr>
+        <w:t xml:space="preserve">Total </w:t>
+      </w:r>
+      <w:r>
+        <w:rPr>
+          <w:rFonts w:ascii="Times New Roman" w:hAnsi="Times New Roman" w:cs="Times New Roman"/>
+          <w:highlight w:val="yellow"/>
+        </w:rPr>
+        <w:t xml:space="preserve">vendido en el </w:t>
+      </w:r>
+      <w:proofErr w:type="spellStart"/>
+      <w:r>
+        <w:rPr>
+          <w:rFonts w:ascii="Times New Roman" w:hAnsi="Times New Roman" w:cs="Times New Roman"/>
+          <w:highlight w:val="yellow"/>
+        </w:rPr>
+        <w:t>dia</w:t>
+      </w:r>
+      <w:proofErr w:type="spellEnd"/>
+      <w:r>
+        <w:rPr>
+          <w:rFonts w:ascii="Times New Roman" w:hAnsi="Times New Roman" w:cs="Times New Roman"/>
+          <w:highlight w:val="yellow"/>
+        </w:rPr>
+        <w:t xml:space="preserve">: </w:t>
+      </w:r>
+      <w:r>
+        <w:rPr>
+          <w:rFonts w:ascii="Times New Roman" w:hAnsi="Times New Roman" w:cs="Times New Roman"/>
+          <w:highlight w:val="yellow"/>
+        </w:rPr>
+        <w:t>"</w:t>
+      </w:r>
+      <w:r>
+        <w:rPr>
+          <w:rFonts w:ascii="Times New Roman" w:hAnsi="Times New Roman" w:cs="Times New Roman"/>
+          <w:highlight w:val="yellow"/>
+        </w:rPr>
+        <w:t xml:space="preserve"> </w:t>
+      </w:r>
+      <w:proofErr w:type="spellStart"/>
+      <w:r>
+        <w:rPr>
+          <w:rFonts w:ascii="Times New Roman" w:hAnsi="Times New Roman" w:cs="Times New Roman"/>
+          <w:highlight w:val="yellow"/>
+        </w:rPr>
+        <w:t>Total_Vendido</w:t>
+      </w:r>
+      <w:proofErr w:type="spellEnd"/>
+    </w:p>
+    <w:p>
+      <w:pPr>
+        <w:rPr>
+          <w:rFonts w:ascii="Times New Roman" w:hAnsi="Times New Roman" w:cs="Times New Roman"/>
+          <w:highlight w:val="yellow"/>
+        </w:rPr>
+      </w:pPr>
+      <w:r>
+        <w:rPr>
+          <w:rFonts w:ascii="Times New Roman" w:hAnsi="Times New Roman" w:cs="Times New Roman"/>
+          <w:highlight w:val="yellow"/>
+        </w:rPr>
+        <w:t xml:space="preserve">Mostrar "Venta mayor del </w:t>
+      </w:r>
+      <w:proofErr w:type="spellStart"/>
+      <w:r>
+        <w:rPr>
+          <w:rFonts w:ascii="Times New Roman" w:hAnsi="Times New Roman" w:cs="Times New Roman"/>
+          <w:highlight w:val="yellow"/>
+        </w:rPr>
+        <w:t>dia</w:t>
+      </w:r>
+      <w:proofErr w:type="spellEnd"/>
+      <w:r>
+        <w:rPr>
+          <w:rFonts w:ascii="Times New Roman" w:hAnsi="Times New Roman" w:cs="Times New Roman"/>
+          <w:highlight w:val="yellow"/>
+        </w:rPr>
+        <w:t xml:space="preserve">: " </w:t>
+      </w:r>
+      <w:proofErr w:type="spellStart"/>
+      <w:r>
+        <w:rPr>
+          <w:rFonts w:ascii="Times New Roman" w:hAnsi="Times New Roman" w:cs="Times New Roman"/>
+          <w:highlight w:val="yellow"/>
+        </w:rPr>
+        <w:t>Venta_Mayor</w:t>
+      </w:r>
+      <w:proofErr w:type="spellEnd"/>
+    </w:p>
+    <w:p>
+      <w:pPr>
+        <w:rPr>
+          <w:rFonts w:ascii="Times New Roman" w:hAnsi="Times New Roman" w:cs="Times New Roman"/>
+          <w:highlight w:val="yellow"/>
+        </w:rPr>
+      </w:pPr>
+      <w:r>
+        <w:rPr>
+          <w:rFonts w:ascii="Times New Roman" w:hAnsi="Times New Roman" w:cs="Times New Roman"/>
+          <w:highlight w:val="yellow"/>
+        </w:rPr>
+        <w:t xml:space="preserve">Mostrar </w:t>
+      </w:r>
+      <w:r>
+        <w:rPr>
+          <w:rFonts w:ascii="Times New Roman" w:hAnsi="Times New Roman" w:cs="Times New Roman"/>
+          <w:highlight w:val="yellow"/>
+        </w:rPr>
+        <w:t>"</w:t>
+      </w:r>
+      <w:r>
+        <w:rPr>
+          <w:rFonts w:ascii="Times New Roman" w:hAnsi="Times New Roman" w:cs="Times New Roman"/>
+          <w:highlight w:val="yellow"/>
+        </w:rPr>
+        <w:t xml:space="preserve">Venta menor del </w:t>
+      </w:r>
+      <w:proofErr w:type="spellStart"/>
+      <w:r>
+        <w:rPr>
+          <w:rFonts w:ascii="Times New Roman" w:hAnsi="Times New Roman" w:cs="Times New Roman"/>
+          <w:highlight w:val="yellow"/>
+        </w:rPr>
+        <w:t>dia</w:t>
+      </w:r>
+      <w:proofErr w:type="spellEnd"/>
+      <w:r>
+        <w:rPr>
+          <w:rFonts w:ascii="Times New Roman" w:hAnsi="Times New Roman" w:cs="Times New Roman"/>
+          <w:highlight w:val="yellow"/>
+        </w:rPr>
+        <w:t xml:space="preserve">: </w:t>
+      </w:r>
+      <w:r>
+        <w:rPr>
+          <w:rFonts w:ascii="Times New Roman" w:hAnsi="Times New Roman" w:cs="Times New Roman"/>
+          <w:highlight w:val="yellow"/>
+        </w:rPr>
+        <w:t>"</w:t>
+      </w:r>
+      <w:r>
+        <w:rPr>
+          <w:rFonts w:ascii="Times New Roman" w:hAnsi="Times New Roman" w:cs="Times New Roman"/>
+          <w:highlight w:val="yellow"/>
+        </w:rPr>
+        <w:t xml:space="preserve"> </w:t>
+      </w:r>
+      <w:proofErr w:type="spellStart"/>
+      <w:r>
+        <w:rPr>
+          <w:rFonts w:ascii="Times New Roman" w:hAnsi="Times New Roman" w:cs="Times New Roman"/>
+          <w:highlight w:val="yellow"/>
+        </w:rPr>
+        <w:t>Venta_Menor</w:t>
+      </w:r>
+      <w:proofErr w:type="spellEnd"/>
+    </w:p>
+    <w:p>
+      <w:pPr>
+        <w:rPr>
+          <w:rFonts w:ascii="Times New Roman" w:hAnsi="Times New Roman" w:cs="Times New Roman"/>
+          <w:highlight w:val="yellow"/>
+        </w:rPr>
+      </w:pPr>
+      <w:proofErr w:type="gramStart"/>
+      <w:r>
+        <w:rPr>
+          <w:rFonts w:ascii="Times New Roman" w:hAnsi="Times New Roman" w:cs="Times New Roman"/>
+          <w:highlight w:val="yellow"/>
+        </w:rPr>
+        <w:t xml:space="preserve">Mostrar </w:t>
+      </w:r>
+      <w:r>
+        <w:rPr>
+          <w:rFonts w:ascii="Times New Roman" w:hAnsi="Times New Roman" w:cs="Times New Roman"/>
+          <w:highlight w:val="yellow"/>
+        </w:rPr>
+        <w:t xml:space="preserve"> "</w:t>
+      </w:r>
+      <w:proofErr w:type="gramEnd"/>
+      <w:r>
+        <w:rPr>
+          <w:rFonts w:ascii="Times New Roman" w:hAnsi="Times New Roman" w:cs="Times New Roman"/>
+          <w:highlight w:val="yellow"/>
+        </w:rPr>
+        <w:t xml:space="preserve">Promedio por venta: </w:t>
+      </w:r>
+      <w:r>
+        <w:rPr>
+          <w:rFonts w:ascii="Times New Roman" w:hAnsi="Times New Roman" w:cs="Times New Roman"/>
+          <w:highlight w:val="yellow"/>
+        </w:rPr>
+        <w:t>"</w:t>
+      </w:r>
+      <w:r>
+        <w:rPr>
+          <w:rFonts w:ascii="Times New Roman" w:hAnsi="Times New Roman" w:cs="Times New Roman"/>
+          <w:highlight w:val="yellow"/>
+        </w:rPr>
+        <w:t xml:space="preserve"> </w:t>
+      </w:r>
+      <w:proofErr w:type="spellStart"/>
+      <w:r>
+        <w:rPr>
+          <w:rFonts w:ascii="Times New Roman" w:hAnsi="Times New Roman" w:cs="Times New Roman"/>
+          <w:highlight w:val="yellow"/>
+        </w:rPr>
+        <w:t>Promediov</w:t>
+      </w:r>
+      <w:proofErr w:type="spellEnd"/>
+    </w:p>
+    <w:p>
+      <w:pPr>
+        <w:rPr>
+          <w:rFonts w:ascii="Times New Roman" w:hAnsi="Times New Roman" w:cs="Times New Roman"/>
+          <w:highlight w:val="yellow"/>
+        </w:rPr>
+      </w:pPr>
+      <w:r>
+        <w:rPr>
+          <w:rFonts w:ascii="Times New Roman" w:hAnsi="Times New Roman" w:cs="Times New Roman"/>
+          <w:highlight w:val="yellow"/>
+        </w:rPr>
+        <w:t xml:space="preserve">Mostrar "Descuentos totales aplicados: " </w:t>
+      </w:r>
+      <w:proofErr w:type="spellStart"/>
+      <w:r>
+        <w:rPr>
+          <w:rFonts w:ascii="Times New Roman" w:hAnsi="Times New Roman" w:cs="Times New Roman"/>
+          <w:highlight w:val="yellow"/>
+        </w:rPr>
+        <w:t>Total_descuentos</w:t>
+      </w:r>
+      <w:proofErr w:type="spellEnd"/>
+    </w:p>
+    <w:p>
+      <w:pPr>
+        <w:rPr>
+          <w:rFonts w:ascii="Times New Roman" w:hAnsi="Times New Roman" w:cs="Times New Roman"/>
+          <w:highlight w:val="yellow"/>
+        </w:rPr>
+      </w:pPr>
+      <w:r>
+        <w:rPr>
+          <w:rFonts w:ascii="Times New Roman" w:hAnsi="Times New Roman" w:cs="Times New Roman"/>
+          <w:highlight w:val="yellow"/>
+        </w:rPr>
+        <w:t xml:space="preserve">Sino </w:t>
+      </w:r>
+    </w:p>
+    <w:p>
+      <w:pPr>
+        <w:rPr>
+          <w:rFonts w:ascii="Times New Roman" w:hAnsi="Times New Roman" w:cs="Times New Roman"/>
+        </w:rPr>
+      </w:pPr>
+      <w:r>
+        <w:rPr>
+          <w:rFonts w:ascii="Times New Roman" w:hAnsi="Times New Roman" w:cs="Times New Roman"/>
+          <w:highlight w:val="yellow"/>
+        </w:rPr>
+        <w:t xml:space="preserve">Mostrar </w:t>
+      </w:r>
+      <w:r>
+        <w:rPr>
+          <w:rFonts w:ascii="Times New Roman" w:hAnsi="Times New Roman" w:cs="Times New Roman"/>
+          <w:highlight w:val="yellow"/>
+        </w:rPr>
+        <w:t>"</w:t>
+      </w:r>
+      <w:r>
+        <w:rPr>
+          <w:rFonts w:ascii="Times New Roman" w:hAnsi="Times New Roman" w:cs="Times New Roman"/>
+          <w:highlight w:val="yellow"/>
+        </w:rPr>
+        <w:t>No se han registrado ventas</w:t>
+      </w:r>
+      <w:r>
+        <w:rPr>
+          <w:rFonts w:ascii="Times New Roman" w:hAnsi="Times New Roman" w:cs="Times New Roman"/>
+        </w:rPr>
+        <w:t>"</w:t>
+      </w:r>
+    </w:p>
+    <w:p>
+      <w:pPr>
+        <w:rPr>
+          <w:rFonts w:ascii="Times New Roman" w:hAnsi="Times New Roman" w:cs="Times New Roman"/>
+        </w:rPr>
+      </w:pPr>
+      <w:proofErr w:type="spellStart"/>
+      <w:r>
+        <w:rPr>
+          <w:rFonts w:ascii="Times New Roman" w:hAnsi="Times New Roman" w:cs="Times New Roman"/>
+        </w:rPr>
+        <w:t>Finsi</w:t>
+      </w:r>
+      <w:proofErr w:type="spellEnd"/>
+    </w:p>
+    <w:p>
+      <w:pPr>
+        <w:rPr>
+          <w:rFonts w:ascii="Times New Roman" w:hAnsi="Times New Roman" w:cs="Times New Roman"/>
+        </w:rPr>
+      </w:pPr>
     </w:p>
     <w:p>
       <w:pPr>
@@ -1957,12 +3231,14 @@
           <w:rFonts w:ascii="Times New Roman" w:hAnsi="Times New Roman" w:cs="Times New Roman"/>
         </w:rPr>
       </w:pPr>
+      <w:proofErr w:type="spellStart"/>
       <w:r>
         <w:rPr>
           <w:rFonts w:ascii="Times New Roman" w:hAnsi="Times New Roman" w:cs="Times New Roman"/>
         </w:rPr>
         <w:t>FinCambiar</w:t>
       </w:r>
+      <w:proofErr w:type="spellEnd"/>
     </w:p>
     <w:p>
       <w:pPr>
@@ -1993,6 +3269,17 @@
         </w:rPr>
         <w:t>Fin</w:t>
       </w:r>
+    </w:p>
+    <w:p>
+      <w:pPr>
+        <w:rPr>
+          <w:rFonts w:ascii="Times New Roman" w:hAnsi="Times New Roman" w:cs="Times New Roman"/>
+          <w:b/>
+          <w:bCs/>
+          <w:sz w:val="28"/>
+          <w:szCs w:val="28"/>
+        </w:rPr>
+      </w:pPr>
     </w:p>
     <w:sectPr>
       <w:pgSz w:w="12240" w:h="15840"/>

</xml_diff>